<commit_message>
Update the pdf draft
</commit_message>
<xml_diff>
--- a/FinalPdfMock.docx
+++ b/FinalPdfMock.docx
@@ -242,9 +242,8 @@
           <w:szCs w:val="40"/>
         </w:rPr>
         <w:lastRenderedPageBreak/>
-        <w:t>Gdb</w:t>
-      </w:r>
-      <w:proofErr w:type="spellEnd"/>
+        <w:t>G</w:t>
+      </w:r>
       <w:r>
         <w:rPr>
           <w:rFonts w:asciiTheme="majorHAnsi" w:eastAsiaTheme="majorEastAsia" w:hAnsiTheme="majorHAnsi" w:cstheme="majorBidi"/>
@@ -252,6 +251,1247 @@
           <w:sz w:val="40"/>
           <w:szCs w:val="40"/>
         </w:rPr>
+        <w:t>of</w:t>
+      </w:r>
+      <w:proofErr w:type="spellEnd"/>
+      <w:r>
+        <w:rPr>
+          <w:rFonts w:asciiTheme="majorHAnsi" w:eastAsiaTheme="majorEastAsia" w:hAnsiTheme="majorHAnsi" w:cstheme="majorBidi"/>
+          <w:color w:val="0F4761" w:themeColor="accent1" w:themeShade="BF"/>
+          <w:sz w:val="40"/>
+          <w:szCs w:val="40"/>
+        </w:rPr>
+        <w:t xml:space="preserve"> Participants</w:t>
+      </w:r>
+    </w:p>
+    <w:p>
+      <w:pPr>
+        <w:spacing w:line="276" w:lineRule="auto"/>
+        <w:rPr>
+          <w:b/>
+          <w:bCs/>
+          <w:sz w:val="28"/>
+          <w:szCs w:val="28"/>
+        </w:rPr>
+      </w:pPr>
+      <w:r>
+        <w:rPr>
+          <w:b/>
+          <w:bCs/>
+          <w:sz w:val="28"/>
+          <w:szCs w:val="28"/>
+        </w:rPr>
+        <w:t>COMMAND</w:t>
+      </w:r>
+    </w:p>
+    <w:tbl>
+      <w:tblPr>
+        <w:tblStyle w:val="TableGrid"/>
+        <w:tblW w:w="0" w:type="auto"/>
+        <w:tblLook w:val="04A0" w:firstRow="1" w:lastRow="0" w:firstColumn="1" w:lastColumn="0" w:noHBand="0" w:noVBand="1"/>
+      </w:tblPr>
+      <w:tblGrid>
+        <w:gridCol w:w="4508"/>
+        <w:gridCol w:w="4508"/>
+      </w:tblGrid>
+      <w:tr>
+        <w:tc>
+          <w:tcPr>
+            <w:tcW w:w="4508" w:type="dxa"/>
+          </w:tcPr>
+          <w:p>
+            <w:pPr>
+              <w:spacing w:line="276" w:lineRule="auto"/>
+              <w:rPr>
+                <w:b/>
+                <w:bCs/>
+                <w:sz w:val="28"/>
+                <w:szCs w:val="28"/>
+              </w:rPr>
+            </w:pPr>
+            <w:r>
+              <w:rPr>
+                <w:b/>
+                <w:bCs/>
+              </w:rPr>
+              <w:t>Invoker</w:t>
+            </w:r>
+          </w:p>
+        </w:tc>
+        <w:tc>
+          <w:tcPr>
+            <w:tcW w:w="4508" w:type="dxa"/>
+          </w:tcPr>
+          <w:p>
+            <w:pPr>
+              <w:spacing w:line="276" w:lineRule="auto"/>
+              <w:rPr>
+                <w:b/>
+                <w:bCs/>
+                <w:sz w:val="28"/>
+                <w:szCs w:val="28"/>
+              </w:rPr>
+            </w:pPr>
+          </w:p>
+        </w:tc>
+      </w:tr>
+      <w:tr>
+        <w:tc>
+          <w:tcPr>
+            <w:tcW w:w="4508" w:type="dxa"/>
+          </w:tcPr>
+          <w:p>
+            <w:pPr>
+              <w:spacing w:line="276" w:lineRule="auto"/>
+              <w:rPr>
+                <w:b/>
+                <w:bCs/>
+                <w:sz w:val="28"/>
+                <w:szCs w:val="28"/>
+              </w:rPr>
+            </w:pPr>
+            <w:r>
+              <w:rPr>
+                <w:b/>
+                <w:bCs/>
+              </w:rPr>
+              <w:t>Command</w:t>
+            </w:r>
+          </w:p>
+        </w:tc>
+        <w:tc>
+          <w:tcPr>
+            <w:tcW w:w="4508" w:type="dxa"/>
+          </w:tcPr>
+          <w:p>
+            <w:pPr>
+              <w:spacing w:line="276" w:lineRule="auto"/>
+              <w:rPr>
+                <w:b/>
+                <w:bCs/>
+                <w:sz w:val="28"/>
+                <w:szCs w:val="28"/>
+              </w:rPr>
+            </w:pPr>
+          </w:p>
+        </w:tc>
+      </w:tr>
+      <w:tr>
+        <w:tc>
+          <w:tcPr>
+            <w:tcW w:w="4508" w:type="dxa"/>
+          </w:tcPr>
+          <w:p>
+            <w:pPr>
+              <w:spacing w:line="276" w:lineRule="auto"/>
+              <w:rPr>
+                <w:b/>
+                <w:bCs/>
+                <w:sz w:val="28"/>
+                <w:szCs w:val="28"/>
+              </w:rPr>
+            </w:pPr>
+            <w:proofErr w:type="spellStart"/>
+            <w:r>
+              <w:rPr>
+                <w:b/>
+                <w:bCs/>
+              </w:rPr>
+              <w:t>ConcreteCommand</w:t>
+            </w:r>
+            <w:proofErr w:type="spellEnd"/>
+          </w:p>
+        </w:tc>
+        <w:tc>
+          <w:tcPr>
+            <w:tcW w:w="4508" w:type="dxa"/>
+          </w:tcPr>
+          <w:p>
+            <w:pPr>
+              <w:spacing w:line="276" w:lineRule="auto"/>
+              <w:rPr>
+                <w:b/>
+                <w:bCs/>
+                <w:sz w:val="28"/>
+                <w:szCs w:val="28"/>
+              </w:rPr>
+            </w:pPr>
+          </w:p>
+        </w:tc>
+      </w:tr>
+      <w:tr>
+        <w:tc>
+          <w:tcPr>
+            <w:tcW w:w="4508" w:type="dxa"/>
+          </w:tcPr>
+          <w:p>
+            <w:pPr>
+              <w:spacing w:line="276" w:lineRule="auto"/>
+              <w:rPr>
+                <w:b/>
+                <w:bCs/>
+                <w:sz w:val="28"/>
+                <w:szCs w:val="28"/>
+              </w:rPr>
+            </w:pPr>
+            <w:r>
+              <w:rPr>
+                <w:b/>
+                <w:bCs/>
+              </w:rPr>
+              <w:t>Receiver</w:t>
+            </w:r>
+          </w:p>
+        </w:tc>
+        <w:tc>
+          <w:tcPr>
+            <w:tcW w:w="4508" w:type="dxa"/>
+          </w:tcPr>
+          <w:p>
+            <w:pPr>
+              <w:spacing w:line="276" w:lineRule="auto"/>
+              <w:rPr>
+                <w:b/>
+                <w:bCs/>
+                <w:sz w:val="28"/>
+                <w:szCs w:val="28"/>
+              </w:rPr>
+            </w:pPr>
+          </w:p>
+        </w:tc>
+      </w:tr>
+    </w:tbl>
+    <w:p>
+      <w:pPr>
+        <w:spacing w:line="276" w:lineRule="auto"/>
+        <w:rPr>
+          <w:b/>
+          <w:bCs/>
+          <w:sz w:val="28"/>
+          <w:szCs w:val="28"/>
+        </w:rPr>
+      </w:pPr>
+    </w:p>
+    <w:p>
+      <w:pPr>
+        <w:spacing w:line="276" w:lineRule="auto"/>
+        <w:rPr>
+          <w:b/>
+          <w:bCs/>
+          <w:sz w:val="28"/>
+          <w:szCs w:val="28"/>
+        </w:rPr>
+      </w:pPr>
+      <w:r>
+        <w:rPr>
+          <w:b/>
+          <w:bCs/>
+          <w:sz w:val="28"/>
+          <w:szCs w:val="28"/>
+        </w:rPr>
+        <w:t>MEDIATOR</w:t>
+      </w:r>
+    </w:p>
+    <w:tbl>
+      <w:tblPr>
+        <w:tblStyle w:val="TableGrid"/>
+        <w:tblW w:w="0" w:type="auto"/>
+        <w:tblLook w:val="04A0" w:firstRow="1" w:lastRow="0" w:firstColumn="1" w:lastColumn="0" w:noHBand="0" w:noVBand="1"/>
+      </w:tblPr>
+      <w:tblGrid>
+        <w:gridCol w:w="4508"/>
+        <w:gridCol w:w="4508"/>
+      </w:tblGrid>
+      <w:tr>
+        <w:tc>
+          <w:tcPr>
+            <w:tcW w:w="4508" w:type="dxa"/>
+          </w:tcPr>
+          <w:p>
+            <w:pPr>
+              <w:spacing w:line="276" w:lineRule="auto"/>
+              <w:rPr>
+                <w:b/>
+                <w:bCs/>
+              </w:rPr>
+            </w:pPr>
+            <w:r>
+              <w:rPr>
+                <w:b/>
+                <w:bCs/>
+              </w:rPr>
+              <w:t>Mediator</w:t>
+            </w:r>
+          </w:p>
+        </w:tc>
+        <w:tc>
+          <w:tcPr>
+            <w:tcW w:w="4508" w:type="dxa"/>
+          </w:tcPr>
+          <w:p>
+            <w:pPr>
+              <w:spacing w:line="276" w:lineRule="auto"/>
+            </w:pPr>
+            <w:proofErr w:type="spellStart"/>
+            <w:r>
+              <w:t>StaffMediator</w:t>
+            </w:r>
+            <w:proofErr w:type="spellEnd"/>
+          </w:p>
+        </w:tc>
+      </w:tr>
+      <w:tr>
+        <w:tc>
+          <w:tcPr>
+            <w:tcW w:w="4508" w:type="dxa"/>
+          </w:tcPr>
+          <w:p>
+            <w:pPr>
+              <w:spacing w:line="276" w:lineRule="auto"/>
+              <w:rPr>
+                <w:b/>
+                <w:bCs/>
+              </w:rPr>
+            </w:pPr>
+            <w:proofErr w:type="spellStart"/>
+            <w:r>
+              <w:rPr>
+                <w:b/>
+                <w:bCs/>
+              </w:rPr>
+              <w:t>ConcreteMediator</w:t>
+            </w:r>
+            <w:proofErr w:type="spellEnd"/>
+          </w:p>
+        </w:tc>
+        <w:tc>
+          <w:tcPr>
+            <w:tcW w:w="4508" w:type="dxa"/>
+          </w:tcPr>
+          <w:p>
+            <w:pPr>
+              <w:spacing w:line="276" w:lineRule="auto"/>
+            </w:pPr>
+            <w:proofErr w:type="spellStart"/>
+            <w:r>
+              <w:t>CampusEmergencyCoordinator</w:t>
+            </w:r>
+            <w:proofErr w:type="spellEnd"/>
+          </w:p>
+        </w:tc>
+      </w:tr>
+      <w:tr>
+        <w:tc>
+          <w:tcPr>
+            <w:tcW w:w="4508" w:type="dxa"/>
+          </w:tcPr>
+          <w:p>
+            <w:pPr>
+              <w:spacing w:line="276" w:lineRule="auto"/>
+              <w:rPr>
+                <w:b/>
+                <w:bCs/>
+              </w:rPr>
+            </w:pPr>
+            <w:r>
+              <w:rPr>
+                <w:b/>
+                <w:bCs/>
+              </w:rPr>
+              <w:t>Colleague</w:t>
+            </w:r>
+          </w:p>
+        </w:tc>
+        <w:tc>
+          <w:tcPr>
+            <w:tcW w:w="4508" w:type="dxa"/>
+          </w:tcPr>
+          <w:p>
+            <w:pPr>
+              <w:spacing w:line="276" w:lineRule="auto"/>
+            </w:pPr>
+            <w:r>
+              <w:t>Staff</w:t>
+            </w:r>
+          </w:p>
+        </w:tc>
+      </w:tr>
+      <w:tr>
+        <w:tc>
+          <w:tcPr>
+            <w:tcW w:w="4508" w:type="dxa"/>
+          </w:tcPr>
+          <w:p>
+            <w:pPr>
+              <w:spacing w:line="276" w:lineRule="auto"/>
+              <w:rPr>
+                <w:b/>
+                <w:bCs/>
+              </w:rPr>
+            </w:pPr>
+            <w:proofErr w:type="spellStart"/>
+            <w:r>
+              <w:rPr>
+                <w:b/>
+                <w:bCs/>
+              </w:rPr>
+              <w:t>ConcreteColleague</w:t>
+            </w:r>
+            <w:proofErr w:type="spellEnd"/>
+          </w:p>
+        </w:tc>
+        <w:tc>
+          <w:tcPr>
+            <w:tcW w:w="4508" w:type="dxa"/>
+          </w:tcPr>
+          <w:p>
+            <w:pPr>
+              <w:spacing w:line="276" w:lineRule="auto"/>
+            </w:pPr>
+            <w:proofErr w:type="spellStart"/>
+            <w:r>
+              <w:t>SecurityService</w:t>
+            </w:r>
+            <w:proofErr w:type="spellEnd"/>
+          </w:p>
+        </w:tc>
+      </w:tr>
+      <w:tr>
+        <w:tc>
+          <w:tcPr>
+            <w:tcW w:w="4508" w:type="dxa"/>
+          </w:tcPr>
+          <w:p>
+            <w:pPr>
+              <w:spacing w:line="276" w:lineRule="auto"/>
+            </w:pPr>
+          </w:p>
+        </w:tc>
+        <w:tc>
+          <w:tcPr>
+            <w:tcW w:w="4508" w:type="dxa"/>
+          </w:tcPr>
+          <w:p>
+            <w:pPr>
+              <w:spacing w:line="276" w:lineRule="auto"/>
+            </w:pPr>
+            <w:proofErr w:type="spellStart"/>
+            <w:r>
+              <w:t>MedicalService</w:t>
+            </w:r>
+            <w:proofErr w:type="spellEnd"/>
+          </w:p>
+        </w:tc>
+      </w:tr>
+      <w:tr>
+        <w:tc>
+          <w:tcPr>
+            <w:tcW w:w="4508" w:type="dxa"/>
+          </w:tcPr>
+          <w:p>
+            <w:pPr>
+              <w:spacing w:line="276" w:lineRule="auto"/>
+            </w:pPr>
+          </w:p>
+        </w:tc>
+        <w:tc>
+          <w:tcPr>
+            <w:tcW w:w="4508" w:type="dxa"/>
+          </w:tcPr>
+          <w:p>
+            <w:pPr>
+              <w:spacing w:line="276" w:lineRule="auto"/>
+            </w:pPr>
+            <w:proofErr w:type="spellStart"/>
+            <w:r>
+              <w:t>FacilityService</w:t>
+            </w:r>
+            <w:proofErr w:type="spellEnd"/>
+          </w:p>
+        </w:tc>
+      </w:tr>
+      <w:tr>
+        <w:tc>
+          <w:tcPr>
+            <w:tcW w:w="4508" w:type="dxa"/>
+          </w:tcPr>
+          <w:p>
+            <w:pPr>
+              <w:spacing w:line="276" w:lineRule="auto"/>
+            </w:pPr>
+          </w:p>
+        </w:tc>
+        <w:tc>
+          <w:tcPr>
+            <w:tcW w:w="4508" w:type="dxa"/>
+          </w:tcPr>
+          <w:p>
+            <w:pPr>
+              <w:spacing w:line="276" w:lineRule="auto"/>
+            </w:pPr>
+            <w:proofErr w:type="spellStart"/>
+            <w:r>
+              <w:t>CommunicationService</w:t>
+            </w:r>
+            <w:proofErr w:type="spellEnd"/>
+          </w:p>
+        </w:tc>
+      </w:tr>
+    </w:tbl>
+    <w:p>
+      <w:pPr>
+        <w:spacing w:line="240" w:lineRule="auto"/>
+        <w:rPr>
+          <w:rFonts w:asciiTheme="majorHAnsi" w:eastAsiaTheme="majorEastAsia" w:hAnsiTheme="majorHAnsi" w:cstheme="majorBidi"/>
+          <w:color w:val="0F4761" w:themeColor="accent1" w:themeShade="BF"/>
+          <w:sz w:val="40"/>
+          <w:szCs w:val="40"/>
+        </w:rPr>
+      </w:pPr>
+    </w:p>
+    <w:p>
+      <w:pPr>
+        <w:spacing w:line="276" w:lineRule="auto"/>
+        <w:rPr>
+          <w:b/>
+          <w:bCs/>
+          <w:sz w:val="28"/>
+          <w:szCs w:val="28"/>
+        </w:rPr>
+      </w:pPr>
+      <w:r>
+        <w:rPr>
+          <w:b/>
+          <w:bCs/>
+          <w:sz w:val="28"/>
+          <w:szCs w:val="28"/>
+        </w:rPr>
+        <w:t>ADAPTER</w:t>
+      </w:r>
+    </w:p>
+    <w:tbl>
+      <w:tblPr>
+        <w:tblStyle w:val="TableGrid"/>
+        <w:tblW w:w="0" w:type="auto"/>
+        <w:tblLook w:val="04A0" w:firstRow="1" w:lastRow="0" w:firstColumn="1" w:lastColumn="0" w:noHBand="0" w:noVBand="1"/>
+      </w:tblPr>
+      <w:tblGrid>
+        <w:gridCol w:w="4508"/>
+        <w:gridCol w:w="4508"/>
+      </w:tblGrid>
+      <w:tr>
+        <w:tc>
+          <w:tcPr>
+            <w:tcW w:w="4508" w:type="dxa"/>
+          </w:tcPr>
+          <w:p>
+            <w:pPr>
+              <w:spacing w:line="276" w:lineRule="auto"/>
+              <w:rPr>
+                <w:b/>
+                <w:bCs/>
+              </w:rPr>
+            </w:pPr>
+            <w:r>
+              <w:rPr>
+                <w:b/>
+                <w:bCs/>
+              </w:rPr>
+              <w:t>Target</w:t>
+            </w:r>
+          </w:p>
+        </w:tc>
+        <w:tc>
+          <w:tcPr>
+            <w:tcW w:w="4508" w:type="dxa"/>
+          </w:tcPr>
+          <w:p>
+            <w:pPr>
+              <w:spacing w:line="276" w:lineRule="auto"/>
+              <w:rPr>
+                <w:b/>
+                <w:bCs/>
+                <w:sz w:val="28"/>
+                <w:szCs w:val="28"/>
+              </w:rPr>
+            </w:pPr>
+          </w:p>
+        </w:tc>
+      </w:tr>
+      <w:tr>
+        <w:tc>
+          <w:tcPr>
+            <w:tcW w:w="4508" w:type="dxa"/>
+          </w:tcPr>
+          <w:p>
+            <w:pPr>
+              <w:spacing w:line="276" w:lineRule="auto"/>
+              <w:rPr>
+                <w:b/>
+                <w:bCs/>
+              </w:rPr>
+            </w:pPr>
+            <w:proofErr w:type="spellStart"/>
+            <w:r>
+              <w:rPr>
+                <w:b/>
+                <w:bCs/>
+              </w:rPr>
+              <w:t>Adaptee</w:t>
+            </w:r>
+            <w:proofErr w:type="spellEnd"/>
+          </w:p>
+        </w:tc>
+        <w:tc>
+          <w:tcPr>
+            <w:tcW w:w="4508" w:type="dxa"/>
+          </w:tcPr>
+          <w:p>
+            <w:pPr>
+              <w:spacing w:line="276" w:lineRule="auto"/>
+              <w:rPr>
+                <w:b/>
+                <w:bCs/>
+                <w:sz w:val="28"/>
+                <w:szCs w:val="28"/>
+              </w:rPr>
+            </w:pPr>
+          </w:p>
+        </w:tc>
+      </w:tr>
+      <w:tr>
+        <w:tc>
+          <w:tcPr>
+            <w:tcW w:w="4508" w:type="dxa"/>
+          </w:tcPr>
+          <w:p>
+            <w:pPr>
+              <w:spacing w:line="276" w:lineRule="auto"/>
+              <w:rPr>
+                <w:b/>
+                <w:bCs/>
+              </w:rPr>
+            </w:pPr>
+            <w:r>
+              <w:rPr>
+                <w:b/>
+                <w:bCs/>
+              </w:rPr>
+              <w:t>Adapter</w:t>
+            </w:r>
+          </w:p>
+        </w:tc>
+        <w:tc>
+          <w:tcPr>
+            <w:tcW w:w="4508" w:type="dxa"/>
+          </w:tcPr>
+          <w:p>
+            <w:pPr>
+              <w:spacing w:line="276" w:lineRule="auto"/>
+              <w:rPr>
+                <w:b/>
+                <w:bCs/>
+                <w:sz w:val="28"/>
+                <w:szCs w:val="28"/>
+              </w:rPr>
+            </w:pPr>
+          </w:p>
+        </w:tc>
+      </w:tr>
+    </w:tbl>
+    <w:p>
+      <w:pPr>
+        <w:spacing w:line="276" w:lineRule="auto"/>
+        <w:rPr>
+          <w:b/>
+          <w:bCs/>
+          <w:sz w:val="28"/>
+          <w:szCs w:val="28"/>
+        </w:rPr>
+      </w:pPr>
+    </w:p>
+    <w:p>
+      <w:pPr>
+        <w:spacing w:line="240" w:lineRule="auto"/>
+        <w:rPr>
+          <w:rFonts w:asciiTheme="majorHAnsi" w:eastAsiaTheme="majorEastAsia" w:hAnsiTheme="majorHAnsi" w:cstheme="majorBidi"/>
+          <w:color w:val="0F4761" w:themeColor="accent1" w:themeShade="BF"/>
+          <w:sz w:val="28"/>
+          <w:szCs w:val="28"/>
+        </w:rPr>
+      </w:pPr>
+    </w:p>
+    <w:p>
+      <w:pPr>
+        <w:spacing w:line="240" w:lineRule="auto"/>
+        <w:rPr>
+          <w:b/>
+          <w:bCs/>
+          <w:sz w:val="28"/>
+          <w:szCs w:val="28"/>
+        </w:rPr>
+      </w:pPr>
+      <w:r>
+        <w:rPr>
+          <w:b/>
+          <w:bCs/>
+          <w:sz w:val="28"/>
+          <w:szCs w:val="28"/>
+        </w:rPr>
+        <w:t>STATE</w:t>
+      </w:r>
+    </w:p>
+    <w:tbl>
+      <w:tblPr>
+        <w:tblStyle w:val="TableGrid"/>
+        <w:tblW w:w="0" w:type="auto"/>
+        <w:tblLook w:val="04A0" w:firstRow="1" w:lastRow="0" w:firstColumn="1" w:lastColumn="0" w:noHBand="0" w:noVBand="1"/>
+      </w:tblPr>
+      <w:tblGrid>
+        <w:gridCol w:w="4508"/>
+        <w:gridCol w:w="4508"/>
+      </w:tblGrid>
+      <w:tr>
+        <w:tc>
+          <w:tcPr>
+            <w:tcW w:w="4508" w:type="dxa"/>
+          </w:tcPr>
+          <w:p>
+            <w:pPr>
+              <w:spacing w:line="276" w:lineRule="auto"/>
+              <w:rPr>
+                <w:b/>
+                <w:bCs/>
+              </w:rPr>
+            </w:pPr>
+            <w:r>
+              <w:rPr>
+                <w:b/>
+                <w:bCs/>
+              </w:rPr>
+              <w:t>Context</w:t>
+            </w:r>
+          </w:p>
+        </w:tc>
+        <w:tc>
+          <w:tcPr>
+            <w:tcW w:w="4508" w:type="dxa"/>
+          </w:tcPr>
+          <w:p>
+            <w:pPr>
+              <w:spacing w:line="276" w:lineRule="auto"/>
+            </w:pPr>
+            <w:r>
+              <w:t>Incident</w:t>
+            </w:r>
+          </w:p>
+        </w:tc>
+      </w:tr>
+      <w:tr>
+        <w:tc>
+          <w:tcPr>
+            <w:tcW w:w="4508" w:type="dxa"/>
+          </w:tcPr>
+          <w:p>
+            <w:pPr>
+              <w:spacing w:line="276" w:lineRule="auto"/>
+              <w:rPr>
+                <w:b/>
+                <w:bCs/>
+              </w:rPr>
+            </w:pPr>
+            <w:r>
+              <w:rPr>
+                <w:b/>
+                <w:bCs/>
+              </w:rPr>
+              <w:t>State</w:t>
+            </w:r>
+          </w:p>
+        </w:tc>
+        <w:tc>
+          <w:tcPr>
+            <w:tcW w:w="4508" w:type="dxa"/>
+          </w:tcPr>
+          <w:p>
+            <w:pPr>
+              <w:spacing w:line="276" w:lineRule="auto"/>
+            </w:pPr>
+            <w:r>
+              <w:t>Condition</w:t>
+            </w:r>
+          </w:p>
+        </w:tc>
+      </w:tr>
+      <w:tr>
+        <w:tc>
+          <w:tcPr>
+            <w:tcW w:w="4508" w:type="dxa"/>
+          </w:tcPr>
+          <w:p>
+            <w:pPr>
+              <w:spacing w:line="276" w:lineRule="auto"/>
+              <w:rPr>
+                <w:b/>
+                <w:bCs/>
+              </w:rPr>
+            </w:pPr>
+            <w:proofErr w:type="spellStart"/>
+            <w:r>
+              <w:rPr>
+                <w:b/>
+                <w:bCs/>
+              </w:rPr>
+              <w:t>ConcreteState</w:t>
+            </w:r>
+            <w:proofErr w:type="spellEnd"/>
+          </w:p>
+        </w:tc>
+        <w:tc>
+          <w:tcPr>
+            <w:tcW w:w="4508" w:type="dxa"/>
+          </w:tcPr>
+          <w:p>
+            <w:pPr>
+              <w:spacing w:line="276" w:lineRule="auto"/>
+            </w:pPr>
+            <w:r>
+              <w:t>Reported</w:t>
+            </w:r>
+          </w:p>
+        </w:tc>
+      </w:tr>
+      <w:tr>
+        <w:tc>
+          <w:tcPr>
+            <w:tcW w:w="4508" w:type="dxa"/>
+          </w:tcPr>
+          <w:p>
+            <w:pPr>
+              <w:spacing w:line="276" w:lineRule="auto"/>
+              <w:rPr>
+                <w:b/>
+                <w:bCs/>
+              </w:rPr>
+            </w:pPr>
+          </w:p>
+        </w:tc>
+        <w:tc>
+          <w:tcPr>
+            <w:tcW w:w="4508" w:type="dxa"/>
+          </w:tcPr>
+          <w:p>
+            <w:pPr>
+              <w:spacing w:line="276" w:lineRule="auto"/>
+            </w:pPr>
+            <w:proofErr w:type="spellStart"/>
+            <w:r>
+              <w:t>BeingWorkedOn</w:t>
+            </w:r>
+            <w:proofErr w:type="spellEnd"/>
+          </w:p>
+        </w:tc>
+      </w:tr>
+      <w:tr>
+        <w:tc>
+          <w:tcPr>
+            <w:tcW w:w="4508" w:type="dxa"/>
+          </w:tcPr>
+          <w:p>
+            <w:pPr>
+              <w:spacing w:line="276" w:lineRule="auto"/>
+              <w:rPr>
+                <w:b/>
+                <w:bCs/>
+              </w:rPr>
+            </w:pPr>
+          </w:p>
+        </w:tc>
+        <w:tc>
+          <w:tcPr>
+            <w:tcW w:w="4508" w:type="dxa"/>
+          </w:tcPr>
+          <w:p>
+            <w:pPr>
+              <w:spacing w:line="276" w:lineRule="auto"/>
+            </w:pPr>
+            <w:proofErr w:type="spellStart"/>
+            <w:r>
+              <w:t>UnderControl</w:t>
+            </w:r>
+            <w:proofErr w:type="spellEnd"/>
+          </w:p>
+        </w:tc>
+      </w:tr>
+      <w:tr>
+        <w:tc>
+          <w:tcPr>
+            <w:tcW w:w="4508" w:type="dxa"/>
+          </w:tcPr>
+          <w:p>
+            <w:pPr>
+              <w:spacing w:line="276" w:lineRule="auto"/>
+              <w:rPr>
+                <w:b/>
+                <w:bCs/>
+              </w:rPr>
+            </w:pPr>
+          </w:p>
+        </w:tc>
+        <w:tc>
+          <w:tcPr>
+            <w:tcW w:w="4508" w:type="dxa"/>
+          </w:tcPr>
+          <w:p>
+            <w:pPr>
+              <w:spacing w:line="276" w:lineRule="auto"/>
+            </w:pPr>
+            <w:r>
+              <w:t>Resolved</w:t>
+            </w:r>
+          </w:p>
+        </w:tc>
+      </w:tr>
+    </w:tbl>
+    <w:p>
+      <w:pPr>
+        <w:spacing w:line="276" w:lineRule="auto"/>
+        <w:rPr>
+          <w:b/>
+          <w:bCs/>
+        </w:rPr>
+      </w:pPr>
+    </w:p>
+    <w:p>
+      <w:pPr>
+        <w:spacing w:line="276" w:lineRule="auto"/>
+        <w:rPr>
+          <w:b/>
+          <w:bCs/>
+        </w:rPr>
+      </w:pPr>
+    </w:p>
+    <w:p>
+      <w:pPr>
+        <w:spacing w:line="240" w:lineRule="auto"/>
+        <w:rPr>
+          <w:b/>
+          <w:bCs/>
+          <w:sz w:val="28"/>
+          <w:szCs w:val="28"/>
+        </w:rPr>
+      </w:pPr>
+      <w:r>
+        <w:rPr>
+          <w:b/>
+          <w:bCs/>
+          <w:sz w:val="28"/>
+          <w:szCs w:val="28"/>
+        </w:rPr>
+        <w:t>OBSERVER</w:t>
+      </w:r>
+    </w:p>
+    <w:tbl>
+      <w:tblPr>
+        <w:tblStyle w:val="TableGrid"/>
+        <w:tblW w:w="0" w:type="auto"/>
+        <w:tblLook w:val="04A0" w:firstRow="1" w:lastRow="0" w:firstColumn="1" w:lastColumn="0" w:noHBand="0" w:noVBand="1"/>
+      </w:tblPr>
+      <w:tblGrid>
+        <w:gridCol w:w="4508"/>
+        <w:gridCol w:w="4508"/>
+      </w:tblGrid>
+      <w:tr>
+        <w:tc>
+          <w:tcPr>
+            <w:tcW w:w="4508" w:type="dxa"/>
+          </w:tcPr>
+          <w:p>
+            <w:pPr>
+              <w:spacing w:line="276" w:lineRule="auto"/>
+              <w:rPr>
+                <w:b/>
+                <w:bCs/>
+              </w:rPr>
+            </w:pPr>
+            <w:r>
+              <w:rPr>
+                <w:b/>
+                <w:bCs/>
+              </w:rPr>
+              <w:lastRenderedPageBreak/>
+              <w:t>Subject</w:t>
+            </w:r>
+          </w:p>
+        </w:tc>
+        <w:tc>
+          <w:tcPr>
+            <w:tcW w:w="4508" w:type="dxa"/>
+          </w:tcPr>
+          <w:p>
+            <w:pPr>
+              <w:spacing w:line="276" w:lineRule="auto"/>
+            </w:pPr>
+            <w:r>
+              <w:t>Subject</w:t>
+            </w:r>
+          </w:p>
+        </w:tc>
+      </w:tr>
+      <w:tr>
+        <w:tc>
+          <w:tcPr>
+            <w:tcW w:w="4508" w:type="dxa"/>
+          </w:tcPr>
+          <w:p>
+            <w:pPr>
+              <w:spacing w:line="276" w:lineRule="auto"/>
+              <w:rPr>
+                <w:b/>
+                <w:bCs/>
+              </w:rPr>
+            </w:pPr>
+            <w:proofErr w:type="spellStart"/>
+            <w:r>
+              <w:rPr>
+                <w:b/>
+                <w:bCs/>
+              </w:rPr>
+              <w:t>ConcreteSubject</w:t>
+            </w:r>
+            <w:proofErr w:type="spellEnd"/>
+          </w:p>
+        </w:tc>
+        <w:tc>
+          <w:tcPr>
+            <w:tcW w:w="4508" w:type="dxa"/>
+          </w:tcPr>
+          <w:p>
+            <w:pPr>
+              <w:spacing w:line="276" w:lineRule="auto"/>
+            </w:pPr>
+            <w:r>
+              <w:t>Incident</w:t>
+            </w:r>
+          </w:p>
+        </w:tc>
+      </w:tr>
+      <w:tr>
+        <w:tc>
+          <w:tcPr>
+            <w:tcW w:w="4508" w:type="dxa"/>
+          </w:tcPr>
+          <w:p>
+            <w:pPr>
+              <w:spacing w:line="276" w:lineRule="auto"/>
+              <w:rPr>
+                <w:b/>
+                <w:bCs/>
+              </w:rPr>
+            </w:pPr>
+            <w:r>
+              <w:rPr>
+                <w:b/>
+                <w:bCs/>
+              </w:rPr>
+              <w:t>Observer</w:t>
+            </w:r>
+          </w:p>
+        </w:tc>
+        <w:tc>
+          <w:tcPr>
+            <w:tcW w:w="4508" w:type="dxa"/>
+          </w:tcPr>
+          <w:p>
+            <w:pPr>
+              <w:spacing w:line="276" w:lineRule="auto"/>
+            </w:pPr>
+            <w:r>
+              <w:t>Observer</w:t>
+            </w:r>
+          </w:p>
+        </w:tc>
+      </w:tr>
+      <w:tr>
+        <w:tc>
+          <w:tcPr>
+            <w:tcW w:w="4508" w:type="dxa"/>
+          </w:tcPr>
+          <w:p>
+            <w:pPr>
+              <w:spacing w:line="276" w:lineRule="auto"/>
+              <w:rPr>
+                <w:b/>
+                <w:bCs/>
+              </w:rPr>
+            </w:pPr>
+            <w:proofErr w:type="spellStart"/>
+            <w:r>
+              <w:rPr>
+                <w:b/>
+                <w:bCs/>
+              </w:rPr>
+              <w:t>ConcreteObserver</w:t>
+            </w:r>
+            <w:proofErr w:type="spellEnd"/>
+          </w:p>
+        </w:tc>
+        <w:tc>
+          <w:tcPr>
+            <w:tcW w:w="4508" w:type="dxa"/>
+          </w:tcPr>
+          <w:p>
+            <w:pPr>
+              <w:spacing w:line="276" w:lineRule="auto"/>
+            </w:pPr>
+            <w:proofErr w:type="spellStart"/>
+            <w:r>
+              <w:t>IncidentMangaer</w:t>
+            </w:r>
+            <w:proofErr w:type="spellEnd"/>
+          </w:p>
+        </w:tc>
+      </w:tr>
+    </w:tbl>
+    <w:p>
+      <w:pPr>
+        <w:spacing w:line="240" w:lineRule="auto"/>
+        <w:rPr>
+          <w:b/>
+          <w:bCs/>
+        </w:rPr>
+      </w:pPr>
+    </w:p>
+    <w:p>
+      <w:pPr>
+        <w:spacing w:line="240" w:lineRule="auto"/>
+        <w:rPr>
+          <w:b/>
+          <w:bCs/>
+          <w:sz w:val="28"/>
+          <w:szCs w:val="28"/>
+        </w:rPr>
+      </w:pPr>
+      <w:r>
+        <w:rPr>
+          <w:b/>
+          <w:bCs/>
+          <w:sz w:val="28"/>
+          <w:szCs w:val="28"/>
+        </w:rPr>
+        <w:t>FAÇADE</w:t>
+      </w:r>
+    </w:p>
+    <w:tbl>
+      <w:tblPr>
+        <w:tblStyle w:val="TableGrid"/>
+        <w:tblW w:w="0" w:type="auto"/>
+        <w:tblLook w:val="04A0" w:firstRow="1" w:lastRow="0" w:firstColumn="1" w:lastColumn="0" w:noHBand="0" w:noVBand="1"/>
+      </w:tblPr>
+      <w:tblGrid>
+        <w:gridCol w:w="4508"/>
+        <w:gridCol w:w="4508"/>
+      </w:tblGrid>
+      <w:tr>
+        <w:tc>
+          <w:tcPr>
+            <w:tcW w:w="4508" w:type="dxa"/>
+          </w:tcPr>
+          <w:p>
+            <w:pPr>
+              <w:spacing w:line="276" w:lineRule="auto"/>
+              <w:rPr>
+                <w:rFonts w:asciiTheme="majorHAnsi" w:eastAsiaTheme="majorEastAsia" w:hAnsiTheme="majorHAnsi" w:cstheme="majorBidi"/>
+                <w:color w:val="0F4761" w:themeColor="accent1" w:themeShade="BF"/>
+                <w:sz w:val="28"/>
+                <w:szCs w:val="28"/>
+              </w:rPr>
+            </w:pPr>
+            <w:r>
+              <w:rPr>
+                <w:b/>
+                <w:bCs/>
+              </w:rPr>
+              <w:t>Facade</w:t>
+            </w:r>
+          </w:p>
+        </w:tc>
+        <w:tc>
+          <w:tcPr>
+            <w:tcW w:w="4508" w:type="dxa"/>
+          </w:tcPr>
+          <w:p>
+            <w:pPr>
+              <w:rPr>
+                <w:rFonts w:asciiTheme="majorHAnsi" w:eastAsiaTheme="majorEastAsia" w:hAnsiTheme="majorHAnsi" w:cstheme="majorBidi"/>
+                <w:color w:val="0F4761" w:themeColor="accent1" w:themeShade="BF"/>
+                <w:sz w:val="28"/>
+                <w:szCs w:val="28"/>
+              </w:rPr>
+            </w:pPr>
+          </w:p>
+        </w:tc>
+      </w:tr>
+    </w:tbl>
+    <w:p>
+      <w:pPr>
+        <w:spacing w:line="240" w:lineRule="auto"/>
+        <w:rPr>
+          <w:rFonts w:asciiTheme="majorHAnsi" w:eastAsiaTheme="majorEastAsia" w:hAnsiTheme="majorHAnsi" w:cstheme="majorBidi"/>
+          <w:color w:val="0F4761" w:themeColor="accent1" w:themeShade="BF"/>
+          <w:sz w:val="28"/>
+          <w:szCs w:val="28"/>
+        </w:rPr>
+      </w:pPr>
+    </w:p>
+    <w:p>
+      <w:pPr>
+        <w:rPr>
+          <w:rFonts w:asciiTheme="majorHAnsi" w:eastAsiaTheme="majorEastAsia" w:hAnsiTheme="majorHAnsi" w:cstheme="majorBidi"/>
+          <w:color w:val="0F4761" w:themeColor="accent1" w:themeShade="BF"/>
+          <w:sz w:val="40"/>
+          <w:szCs w:val="40"/>
+        </w:rPr>
+      </w:pPr>
+      <w:r>
+        <w:rPr>
+          <w:rFonts w:asciiTheme="majorHAnsi" w:eastAsiaTheme="majorEastAsia" w:hAnsiTheme="majorHAnsi" w:cstheme="majorBidi"/>
+          <w:color w:val="0F4761" w:themeColor="accent1" w:themeShade="BF"/>
+          <w:sz w:val="40"/>
+          <w:szCs w:val="40"/>
+        </w:rPr>
+        <w:br w:type="page"/>
+      </w:r>
+    </w:p>
+    <w:p>
+      <w:pPr>
+        <w:spacing w:line="240" w:lineRule="auto"/>
+        <w:rPr>
+          <w:rFonts w:asciiTheme="majorHAnsi" w:eastAsiaTheme="majorEastAsia" w:hAnsiTheme="majorHAnsi" w:cstheme="majorBidi"/>
+          <w:color w:val="0F4761" w:themeColor="accent1" w:themeShade="BF"/>
+          <w:sz w:val="40"/>
+          <w:szCs w:val="40"/>
+        </w:rPr>
+      </w:pPr>
+      <w:proofErr w:type="spellStart"/>
+      <w:r>
+        <w:rPr>
+          <w:rFonts w:asciiTheme="majorHAnsi" w:eastAsiaTheme="majorEastAsia" w:hAnsiTheme="majorHAnsi" w:cstheme="majorBidi"/>
+          <w:color w:val="0F4761" w:themeColor="accent1" w:themeShade="BF"/>
+          <w:sz w:val="40"/>
+          <w:szCs w:val="40"/>
+        </w:rPr>
+        <w:lastRenderedPageBreak/>
+        <w:t>Gdb</w:t>
+      </w:r>
+      <w:proofErr w:type="spellEnd"/>
+      <w:r>
+        <w:rPr>
+          <w:rFonts w:asciiTheme="majorHAnsi" w:eastAsiaTheme="majorEastAsia" w:hAnsiTheme="majorHAnsi" w:cstheme="majorBidi"/>
+          <w:color w:val="0F4761" w:themeColor="accent1" w:themeShade="BF"/>
+          <w:sz w:val="40"/>
+          <w:szCs w:val="40"/>
+        </w:rPr>
         <w:t xml:space="preserve"> </w:t>
       </w:r>
     </w:p>
@@ -417,7 +1657,7 @@
           <w:noProof/>
         </w:rPr>
         <w:drawing>
-          <wp:inline distT="0" distB="0" distL="0" distR="0" wp14:anchorId="1D9AB8EA" wp14:editId="00C47750">
+          <wp:inline distT="0" distB="0" distL="0" distR="0" wp14:anchorId="1D9AB8EA" wp14:editId="63F2DDC6">
             <wp:extent cx="6057690" cy="2175933"/>
             <wp:effectExtent l="0" t="0" r="635" b="0"/>
             <wp:docPr id="1485024030" name="Picture 1"/>
@@ -476,7 +1716,7 @@
         </w:rPr>
         <w:lastRenderedPageBreak/>
         <w:drawing>
-          <wp:inline distT="0" distB="0" distL="0" distR="0" wp14:anchorId="57959CA9" wp14:editId="166D78EA">
+          <wp:inline distT="0" distB="0" distL="0" distR="0" wp14:anchorId="57959CA9" wp14:editId="3087C73B">
             <wp:extent cx="5181600" cy="2722925"/>
             <wp:effectExtent l="0" t="0" r="0" b="1270"/>
             <wp:docPr id="1715487094" name="Picture 2"/>
@@ -1018,7 +2258,7 @@
         </w:rPr>
         <w:lastRenderedPageBreak/>
         <w:drawing>
-          <wp:inline distT="0" distB="0" distL="0" distR="0" wp14:anchorId="0DBD22B2" wp14:editId="471F4A2D">
+          <wp:inline distT="0" distB="0" distL="0" distR="0" wp14:anchorId="0DBD22B2" wp14:editId="4FA60E84">
             <wp:extent cx="5715000" cy="2997200"/>
             <wp:effectExtent l="0" t="0" r="0" b="0"/>
             <wp:docPr id="1989881974" name="Picture 4"/>
@@ -1073,7 +2313,7 @@
           <w:noProof/>
         </w:rPr>
         <w:drawing>
-          <wp:inline distT="0" distB="0" distL="0" distR="0" wp14:anchorId="1DA3A170" wp14:editId="59485630">
+          <wp:inline distT="0" distB="0" distL="0" distR="0" wp14:anchorId="1DA3A170" wp14:editId="15754A0A">
             <wp:extent cx="5727700" cy="3060700"/>
             <wp:effectExtent l="0" t="0" r="6350" b="6350"/>
             <wp:docPr id="1528522615" name="Picture 5"/>
@@ -1723,7 +2963,7 @@
   <w:style w:type="paragraph" w:default="1" w:styleId="Normal">
     <w:name w:val="Normal"/>
     <w:qFormat/>
-    <w:rsid w:val="001838A7"/>
+    <w:rsid w:val="00F12089"/>
   </w:style>
   <w:style w:type="paragraph" w:styleId="Heading1">
     <w:name w:val="heading 1"/>
@@ -2241,6 +3481,25 @@
       <w:spacing w:val="5"/>
     </w:rPr>
   </w:style>
+  <w:style w:type="table" w:styleId="TableGrid">
+    <w:name w:val="Table Grid"/>
+    <w:basedOn w:val="TableNormal"/>
+    <w:uiPriority w:val="39"/>
+    <w:rsid w:val="00F91C55"/>
+    <w:pPr>
+      <w:spacing w:after="0" w:line="240" w:lineRule="auto"/>
+    </w:pPr>
+    <w:tblPr>
+      <w:tblBorders>
+        <w:top w:val="single" w:sz="4" w:space="0" w:color="auto"/>
+        <w:left w:val="single" w:sz="4" w:space="0" w:color="auto"/>
+        <w:bottom w:val="single" w:sz="4" w:space="0" w:color="auto"/>
+        <w:right w:val="single" w:sz="4" w:space="0" w:color="auto"/>
+        <w:insideH w:val="single" w:sz="4" w:space="0" w:color="auto"/>
+        <w:insideV w:val="single" w:sz="4" w:space="0" w:color="auto"/>
+      </w:tblBorders>
+    </w:tblPr>
+  </w:style>
 </w:styles>
 </file>
 

</xml_diff>

<commit_message>
Did the second sequence diagram and made changes to doc. There are 2 diagrams. Use the "Adapter/Facade Sequence Diagram.vpp" file
There are 2 diagrams. Use the "Adapter/Facade Sequence Diagram.vpp" file
</commit_message>
<xml_diff>
--- a/FinalPdfMock.docx
+++ b/FinalPdfMock.docx
@@ -4,31 +4,10 @@
   <w:body>
     <w:p>
       <w:pPr>
-        <w:spacing w:line="240" w:lineRule="auto"/>
+        <w:pStyle w:val="Title"/>
         <w:jc w:val="center"/>
-        <w:rPr>
-          <w:rFonts w:asciiTheme="majorHAnsi" w:eastAsiaTheme="majorEastAsia" w:hAnsiTheme="majorHAnsi" w:cstheme="majorBidi"/>
-          <w:color w:val="0F4761" w:themeColor="accent1" w:themeShade="BF"/>
-          <w:sz w:val="40"/>
-          <w:szCs w:val="40"/>
-        </w:rPr>
-      </w:pPr>
-      <w:r>
-        <w:rPr>
-          <w:rFonts w:asciiTheme="majorHAnsi" w:eastAsiaTheme="majorEastAsia" w:hAnsiTheme="majorHAnsi" w:cstheme="majorBidi"/>
-          <w:color w:val="0F4761" w:themeColor="accent1" w:themeShade="BF"/>
-          <w:sz w:val="40"/>
-          <w:szCs w:val="40"/>
-        </w:rPr>
-        <w:t xml:space="preserve">      </w:t>
-      </w:r>
-      <w:r>
-        <w:rPr>
-          <w:rFonts w:asciiTheme="majorHAnsi" w:eastAsiaTheme="majorEastAsia" w:hAnsiTheme="majorHAnsi" w:cstheme="majorBidi"/>
-          <w:color w:val="0F4761" w:themeColor="accent1" w:themeShade="BF"/>
-          <w:sz w:val="40"/>
-          <w:szCs w:val="40"/>
-        </w:rPr>
+      </w:pPr>
+      <w:r>
         <w:t>COS 226 – PRAC 5</w:t>
       </w:r>
     </w:p>
@@ -207,10 +186,75 @@
         <w:rPr>
           <w:rFonts w:asciiTheme="majorHAnsi" w:eastAsiaTheme="majorEastAsia" w:hAnsiTheme="majorHAnsi" w:cstheme="majorBidi"/>
           <w:color w:val="0F4761" w:themeColor="accent1" w:themeShade="BF"/>
-          <w:sz w:val="36"/>
-          <w:szCs w:val="36"/>
-        </w:rPr>
-      </w:pPr>
+          <w:sz w:val="40"/>
+          <w:szCs w:val="40"/>
+        </w:rPr>
+      </w:pPr>
+    </w:p>
+    <w:p>
+      <w:pPr>
+        <w:pStyle w:val="Heading1"/>
+        <w:rPr>
+          <w:b/>
+          <w:bCs/>
+        </w:rPr>
+      </w:pPr>
+      <w:proofErr w:type="spellStart"/>
+      <w:r>
+        <w:rPr>
+          <w:b/>
+          <w:bCs/>
+        </w:rPr>
+        <w:t>CampusGuard</w:t>
+      </w:r>
+      <w:proofErr w:type="spellEnd"/>
+      <w:r>
+        <w:rPr>
+          <w:b/>
+          <w:bCs/>
+        </w:rPr>
+        <w:t xml:space="preserve"> description: </w:t>
+      </w:r>
+    </w:p>
+    <w:p>
+      <w:pPr>
+        <w:spacing w:line="240" w:lineRule="auto"/>
+        <w:rPr>
+          <w:rFonts w:asciiTheme="majorHAnsi" w:eastAsiaTheme="majorEastAsia" w:hAnsiTheme="majorHAnsi" w:cstheme="majorBidi"/>
+          <w:color w:val="0F4761" w:themeColor="accent1" w:themeShade="BF"/>
+          <w:sz w:val="32"/>
+          <w:szCs w:val="32"/>
+        </w:rPr>
+      </w:pPr>
+      <w:proofErr w:type="spellStart"/>
+      <w:r>
+        <w:rPr>
+          <w:rFonts w:asciiTheme="majorHAnsi" w:eastAsiaTheme="majorEastAsia" w:hAnsiTheme="majorHAnsi" w:cstheme="majorBidi"/>
+          <w:color w:val="0F4761" w:themeColor="accent1" w:themeShade="BF"/>
+          <w:sz w:val="32"/>
+          <w:szCs w:val="32"/>
+        </w:rPr>
+        <w:t>CampusGuard</w:t>
+      </w:r>
+      <w:proofErr w:type="spellEnd"/>
+      <w:r>
+        <w:rPr>
+          <w:rFonts w:asciiTheme="majorHAnsi" w:eastAsiaTheme="majorEastAsia" w:hAnsiTheme="majorHAnsi" w:cstheme="majorBidi"/>
+          <w:color w:val="0F4761" w:themeColor="accent1" w:themeShade="BF"/>
+          <w:sz w:val="32"/>
+          <w:szCs w:val="32"/>
+        </w:rPr>
+        <w:t xml:space="preserve"> is an application designed to </w:t>
+      </w:r>
+      <w:r>
+        <w:rPr>
+          <w:rFonts w:asciiTheme="majorHAnsi" w:eastAsiaTheme="majorEastAsia" w:hAnsiTheme="majorHAnsi" w:cstheme="majorBidi"/>
+          <w:color w:val="0F4761" w:themeColor="accent1" w:themeShade="BF"/>
+          <w:sz w:val="32"/>
+          <w:szCs w:val="32"/>
+        </w:rPr>
+        <w:t>manage incidents that may occur on a campus by dispatching teams to resolve them and changing building access levels to prevent the public from entering restricted areas.</w:t>
+      </w:r>
     </w:p>
     <w:p>
       <w:pPr>
@@ -228,53 +272,11 @@
         <w:spacing w:line="240" w:lineRule="auto"/>
         <w:rPr>
           <w:rFonts w:asciiTheme="majorHAnsi" w:eastAsiaTheme="majorEastAsia" w:hAnsiTheme="majorHAnsi" w:cstheme="majorBidi"/>
-          <w:b/>
-          <w:bCs/>
           <w:color w:val="0F4761" w:themeColor="accent1" w:themeShade="BF"/>
-          <w:sz w:val="36"/>
-          <w:szCs w:val="36"/>
-        </w:rPr>
-      </w:pPr>
-      <w:r>
-        <w:rPr>
-          <w:rFonts w:asciiTheme="majorHAnsi" w:eastAsiaTheme="majorEastAsia" w:hAnsiTheme="majorHAnsi" w:cstheme="majorBidi"/>
-          <w:b/>
-          <w:bCs/>
-          <w:color w:val="0F4761" w:themeColor="accent1" w:themeShade="BF"/>
-          <w:sz w:val="36"/>
-          <w:szCs w:val="36"/>
-        </w:rPr>
-        <w:t xml:space="preserve">CampusGuard description: </w:t>
-      </w:r>
-    </w:p>
-    <w:p>
-      <w:pPr>
-        <w:spacing w:line="240" w:lineRule="auto"/>
-        <w:rPr>
-          <w:rFonts w:asciiTheme="majorHAnsi" w:eastAsiaTheme="majorEastAsia" w:hAnsiTheme="majorHAnsi" w:cstheme="majorBidi"/>
-          <w:color w:val="0F4761" w:themeColor="accent1" w:themeShade="BF"/>
-          <w:sz w:val="32"/>
-          <w:szCs w:val="32"/>
-        </w:rPr>
-      </w:pPr>
-      <w:r>
-        <w:rPr>
-          <w:rFonts w:asciiTheme="majorHAnsi" w:eastAsiaTheme="majorEastAsia" w:hAnsiTheme="majorHAnsi" w:cstheme="majorBidi"/>
-          <w:color w:val="0F4761" w:themeColor="accent1" w:themeShade="BF"/>
-          <w:sz w:val="32"/>
-          <w:szCs w:val="32"/>
-        </w:rPr>
-        <w:t xml:space="preserve">CampusGuard is an application designed to </w:t>
-      </w:r>
-      <w:r>
-        <w:rPr>
-          <w:rFonts w:asciiTheme="majorHAnsi" w:eastAsiaTheme="majorEastAsia" w:hAnsiTheme="majorHAnsi" w:cstheme="majorBidi"/>
-          <w:color w:val="0F4761" w:themeColor="accent1" w:themeShade="BF"/>
-          <w:sz w:val="32"/>
-          <w:szCs w:val="32"/>
-        </w:rPr>
-        <w:t>manage incidents that may occur on a campus by dispatching teams to resolve them and changing building access levels to prevent the public from entering restricted areas.</w:t>
-      </w:r>
+          <w:sz w:val="40"/>
+          <w:szCs w:val="40"/>
+        </w:rPr>
+      </w:pPr>
     </w:p>
     <w:p>
       <w:pPr>
@@ -351,7 +353,22 @@
           <w:sz w:val="40"/>
           <w:szCs w:val="40"/>
         </w:rPr>
-      </w:pPr>
+        <w:sectPr>
+          <w:pgSz w:w="11906" w:h="16838"/>
+          <w:pgMar w:top="1440" w:right="1440" w:bottom="1440" w:left="1440" w:header="720" w:footer="720" w:gutter="0"/>
+          <w:cols w:space="720"/>
+          <w:docGrid w:linePitch="360"/>
+        </w:sectPr>
+      </w:pPr>
+    </w:p>
+    <w:p>
+      <w:pPr>
+        <w:pStyle w:val="Heading1"/>
+      </w:pPr>
+      <w:r>
+        <w:lastRenderedPageBreak/>
+        <w:t>UML Class Diagram</w:t>
+      </w:r>
     </w:p>
     <w:p>
       <w:pPr>
@@ -362,60 +379,12 @@
           <w:sz w:val="40"/>
           <w:szCs w:val="40"/>
         </w:rPr>
-      </w:pPr>
-    </w:p>
-    <w:p>
-      <w:pPr>
-        <w:spacing w:line="240" w:lineRule="auto"/>
-        <w:rPr>
-          <w:rFonts w:asciiTheme="majorHAnsi" w:eastAsiaTheme="majorEastAsia" w:hAnsiTheme="majorHAnsi" w:cstheme="majorBidi"/>
-          <w:color w:val="0F4761" w:themeColor="accent1" w:themeShade="BF"/>
-          <w:sz w:val="40"/>
-          <w:szCs w:val="40"/>
-        </w:rPr>
-      </w:pPr>
-    </w:p>
-    <w:p>
-      <w:pPr>
-        <w:spacing w:line="240" w:lineRule="auto"/>
-        <w:rPr>
-          <w:rFonts w:asciiTheme="majorHAnsi" w:eastAsiaTheme="majorEastAsia" w:hAnsiTheme="majorHAnsi" w:cstheme="majorBidi"/>
-          <w:color w:val="0F4761" w:themeColor="accent1" w:themeShade="BF"/>
-          <w:sz w:val="40"/>
-          <w:szCs w:val="40"/>
-        </w:rPr>
-      </w:pPr>
-    </w:p>
-    <w:p>
-      <w:pPr>
-        <w:spacing w:line="240" w:lineRule="auto"/>
-        <w:rPr>
-          <w:rFonts w:asciiTheme="majorHAnsi" w:eastAsiaTheme="majorEastAsia" w:hAnsiTheme="majorHAnsi" w:cstheme="majorBidi"/>
-          <w:color w:val="0F4761" w:themeColor="accent1" w:themeShade="BF"/>
-          <w:sz w:val="40"/>
-          <w:szCs w:val="40"/>
-        </w:rPr>
-      </w:pPr>
-      <w:r>
-        <w:rPr>
-          <w:rFonts w:asciiTheme="majorHAnsi" w:eastAsiaTheme="majorEastAsia" w:hAnsiTheme="majorHAnsi" w:cstheme="majorBidi"/>
-          <w:color w:val="0F4761" w:themeColor="accent1" w:themeShade="BF"/>
-          <w:sz w:val="40"/>
-          <w:szCs w:val="40"/>
-        </w:rPr>
-        <w:lastRenderedPageBreak/>
-        <w:t>UML Class Diagram</w:t>
-      </w:r>
-    </w:p>
-    <w:p>
-      <w:pPr>
-        <w:spacing w:line="240" w:lineRule="auto"/>
-        <w:rPr>
-          <w:rFonts w:asciiTheme="majorHAnsi" w:eastAsiaTheme="majorEastAsia" w:hAnsiTheme="majorHAnsi" w:cstheme="majorBidi"/>
-          <w:color w:val="0F4761" w:themeColor="accent1" w:themeShade="BF"/>
-          <w:sz w:val="40"/>
-          <w:szCs w:val="40"/>
-        </w:rPr>
+        <w:sectPr>
+          <w:pgSz w:w="16838" w:h="11906" w:orient="landscape"/>
+          <w:pgMar w:top="1440" w:right="1440" w:bottom="1440" w:left="1440" w:header="720" w:footer="720" w:gutter="0"/>
+          <w:cols w:space="720"/>
+          <w:docGrid w:linePitch="360"/>
+        </w:sectPr>
       </w:pPr>
       <w:r>
         <w:rPr>
@@ -426,9 +395,9 @@
           <w:szCs w:val="40"/>
         </w:rPr>
         <w:drawing>
-          <wp:inline distT="0" distB="0" distL="0" distR="0" wp14:anchorId="7016B486" wp14:editId="615ED863">
-            <wp:extent cx="5722620" cy="2796540"/>
-            <wp:effectExtent l="0" t="0" r="0" b="3810"/>
+          <wp:inline distT="0" distB="0" distL="0" distR="0" wp14:anchorId="7016B486" wp14:editId="1A55A1B5">
+            <wp:extent cx="8962845" cy="4379979"/>
+            <wp:effectExtent l="0" t="0" r="0" b="1905"/>
             <wp:docPr id="102056122" name="Picture 1"/>
             <wp:cNvGraphicFramePr>
               <a:graphicFrameLocks xmlns:a="http://schemas.openxmlformats.org/drawingml/2006/main" noChangeAspect="1"/>
@@ -458,7 +427,7 @@
                   <pic:spPr bwMode="auto">
                     <a:xfrm>
                       <a:off x="0" y="0"/>
-                      <a:ext cx="5722620" cy="2796540"/>
+                      <a:ext cx="8992489" cy="4394465"/>
                     </a:xfrm>
                     <a:prstGeom prst="rect">
                       <a:avLst/>
@@ -477,251 +446,19 @@
     </w:p>
     <w:p>
       <w:pPr>
-        <w:spacing w:line="240" w:lineRule="auto"/>
-        <w:rPr>
-          <w:rFonts w:asciiTheme="majorHAnsi" w:eastAsiaTheme="majorEastAsia" w:hAnsiTheme="majorHAnsi" w:cstheme="majorBidi"/>
-          <w:color w:val="0F4761" w:themeColor="accent1" w:themeShade="BF"/>
-          <w:sz w:val="40"/>
-          <w:szCs w:val="40"/>
-        </w:rPr>
-      </w:pPr>
-    </w:p>
-    <w:p>
-      <w:pPr>
-        <w:spacing w:line="240" w:lineRule="auto"/>
-        <w:rPr>
-          <w:rFonts w:asciiTheme="majorHAnsi" w:eastAsiaTheme="majorEastAsia" w:hAnsiTheme="majorHAnsi" w:cstheme="majorBidi"/>
-          <w:color w:val="0F4761" w:themeColor="accent1" w:themeShade="BF"/>
-          <w:sz w:val="40"/>
-          <w:szCs w:val="40"/>
-        </w:rPr>
-      </w:pPr>
-    </w:p>
-    <w:p>
-      <w:pPr>
-        <w:spacing w:line="240" w:lineRule="auto"/>
-        <w:rPr>
-          <w:rFonts w:asciiTheme="majorHAnsi" w:eastAsiaTheme="majorEastAsia" w:hAnsiTheme="majorHAnsi" w:cstheme="majorBidi"/>
-          <w:color w:val="0F4761" w:themeColor="accent1" w:themeShade="BF"/>
-          <w:sz w:val="40"/>
-          <w:szCs w:val="40"/>
-        </w:rPr>
-      </w:pPr>
-    </w:p>
-    <w:p>
-      <w:pPr>
-        <w:spacing w:line="240" w:lineRule="auto"/>
-        <w:rPr>
-          <w:rFonts w:asciiTheme="majorHAnsi" w:eastAsiaTheme="majorEastAsia" w:hAnsiTheme="majorHAnsi" w:cstheme="majorBidi"/>
-          <w:color w:val="0F4761" w:themeColor="accent1" w:themeShade="BF"/>
-          <w:sz w:val="40"/>
-          <w:szCs w:val="40"/>
-        </w:rPr>
-      </w:pPr>
-    </w:p>
-    <w:p>
-      <w:pPr>
-        <w:spacing w:line="240" w:lineRule="auto"/>
-        <w:rPr>
-          <w:rFonts w:asciiTheme="majorHAnsi" w:eastAsiaTheme="majorEastAsia" w:hAnsiTheme="majorHAnsi" w:cstheme="majorBidi"/>
-          <w:color w:val="0F4761" w:themeColor="accent1" w:themeShade="BF"/>
-          <w:sz w:val="40"/>
-          <w:szCs w:val="40"/>
-        </w:rPr>
-      </w:pPr>
-    </w:p>
-    <w:p>
-      <w:pPr>
-        <w:spacing w:line="240" w:lineRule="auto"/>
-        <w:rPr>
-          <w:rFonts w:asciiTheme="majorHAnsi" w:eastAsiaTheme="majorEastAsia" w:hAnsiTheme="majorHAnsi" w:cstheme="majorBidi"/>
-          <w:color w:val="0F4761" w:themeColor="accent1" w:themeShade="BF"/>
-          <w:sz w:val="40"/>
-          <w:szCs w:val="40"/>
-        </w:rPr>
-      </w:pPr>
-    </w:p>
-    <w:p>
-      <w:pPr>
-        <w:spacing w:line="240" w:lineRule="auto"/>
-        <w:rPr>
-          <w:rFonts w:asciiTheme="majorHAnsi" w:eastAsiaTheme="majorEastAsia" w:hAnsiTheme="majorHAnsi" w:cstheme="majorBidi"/>
-          <w:color w:val="0F4761" w:themeColor="accent1" w:themeShade="BF"/>
-          <w:sz w:val="40"/>
-          <w:szCs w:val="40"/>
-        </w:rPr>
-      </w:pPr>
-    </w:p>
-    <w:p>
-      <w:pPr>
-        <w:spacing w:line="240" w:lineRule="auto"/>
-        <w:rPr>
-          <w:rFonts w:asciiTheme="majorHAnsi" w:eastAsiaTheme="majorEastAsia" w:hAnsiTheme="majorHAnsi" w:cstheme="majorBidi"/>
-          <w:color w:val="0F4761" w:themeColor="accent1" w:themeShade="BF"/>
-          <w:sz w:val="40"/>
-          <w:szCs w:val="40"/>
-        </w:rPr>
-      </w:pPr>
-    </w:p>
-    <w:p>
-      <w:pPr>
-        <w:spacing w:line="240" w:lineRule="auto"/>
-        <w:rPr>
-          <w:rFonts w:asciiTheme="majorHAnsi" w:eastAsiaTheme="majorEastAsia" w:hAnsiTheme="majorHAnsi" w:cstheme="majorBidi"/>
-          <w:color w:val="0F4761" w:themeColor="accent1" w:themeShade="BF"/>
-          <w:sz w:val="40"/>
-          <w:szCs w:val="40"/>
-        </w:rPr>
-      </w:pPr>
-    </w:p>
-    <w:p>
-      <w:pPr>
-        <w:spacing w:line="240" w:lineRule="auto"/>
-        <w:rPr>
-          <w:rFonts w:asciiTheme="majorHAnsi" w:eastAsiaTheme="majorEastAsia" w:hAnsiTheme="majorHAnsi" w:cstheme="majorBidi"/>
-          <w:color w:val="0F4761" w:themeColor="accent1" w:themeShade="BF"/>
-          <w:sz w:val="40"/>
-          <w:szCs w:val="40"/>
-        </w:rPr>
-      </w:pPr>
-    </w:p>
-    <w:p>
-      <w:pPr>
-        <w:spacing w:line="240" w:lineRule="auto"/>
-        <w:rPr>
-          <w:rFonts w:asciiTheme="majorHAnsi" w:eastAsiaTheme="majorEastAsia" w:hAnsiTheme="majorHAnsi" w:cstheme="majorBidi"/>
-          <w:color w:val="0F4761" w:themeColor="accent1" w:themeShade="BF"/>
-          <w:sz w:val="40"/>
-          <w:szCs w:val="40"/>
-        </w:rPr>
-      </w:pPr>
-    </w:p>
-    <w:p>
-      <w:pPr>
-        <w:spacing w:line="240" w:lineRule="auto"/>
-        <w:rPr>
-          <w:rFonts w:asciiTheme="majorHAnsi" w:eastAsiaTheme="majorEastAsia" w:hAnsiTheme="majorHAnsi" w:cstheme="majorBidi"/>
-          <w:color w:val="0F4761" w:themeColor="accent1" w:themeShade="BF"/>
-          <w:sz w:val="40"/>
-          <w:szCs w:val="40"/>
-        </w:rPr>
-      </w:pPr>
-    </w:p>
-    <w:p>
-      <w:pPr>
-        <w:spacing w:line="240" w:lineRule="auto"/>
-        <w:rPr>
-          <w:rFonts w:asciiTheme="majorHAnsi" w:eastAsiaTheme="majorEastAsia" w:hAnsiTheme="majorHAnsi" w:cstheme="majorBidi"/>
-          <w:color w:val="0F4761" w:themeColor="accent1" w:themeShade="BF"/>
-          <w:sz w:val="40"/>
-          <w:szCs w:val="40"/>
-        </w:rPr>
-      </w:pPr>
-    </w:p>
-    <w:p>
-      <w:pPr>
-        <w:spacing w:line="240" w:lineRule="auto"/>
-        <w:rPr>
-          <w:rFonts w:asciiTheme="majorHAnsi" w:eastAsiaTheme="majorEastAsia" w:hAnsiTheme="majorHAnsi" w:cstheme="majorBidi"/>
-          <w:color w:val="0F4761" w:themeColor="accent1" w:themeShade="BF"/>
-          <w:sz w:val="40"/>
-          <w:szCs w:val="40"/>
-        </w:rPr>
-      </w:pPr>
-    </w:p>
-    <w:p>
-      <w:pPr>
-        <w:spacing w:line="240" w:lineRule="auto"/>
-        <w:rPr>
-          <w:rFonts w:asciiTheme="majorHAnsi" w:eastAsiaTheme="majorEastAsia" w:hAnsiTheme="majorHAnsi" w:cstheme="majorBidi"/>
-          <w:color w:val="0F4761" w:themeColor="accent1" w:themeShade="BF"/>
-          <w:sz w:val="40"/>
-          <w:szCs w:val="40"/>
-        </w:rPr>
-      </w:pPr>
-    </w:p>
-    <w:p>
-      <w:pPr>
-        <w:spacing w:line="240" w:lineRule="auto"/>
-        <w:rPr>
-          <w:rFonts w:asciiTheme="majorHAnsi" w:eastAsiaTheme="majorEastAsia" w:hAnsiTheme="majorHAnsi" w:cstheme="majorBidi"/>
-          <w:color w:val="0F4761" w:themeColor="accent1" w:themeShade="BF"/>
-          <w:sz w:val="40"/>
-          <w:szCs w:val="40"/>
-        </w:rPr>
-      </w:pPr>
-    </w:p>
-    <w:p>
-      <w:pPr>
-        <w:spacing w:line="240" w:lineRule="auto"/>
-        <w:rPr>
-          <w:rFonts w:asciiTheme="majorHAnsi" w:eastAsiaTheme="majorEastAsia" w:hAnsiTheme="majorHAnsi" w:cstheme="majorBidi"/>
-          <w:color w:val="0F4761" w:themeColor="accent1" w:themeShade="BF"/>
-          <w:sz w:val="40"/>
-          <w:szCs w:val="40"/>
-        </w:rPr>
-      </w:pPr>
-    </w:p>
-    <w:p>
-      <w:pPr>
-        <w:spacing w:line="240" w:lineRule="auto"/>
-        <w:rPr>
-          <w:rFonts w:asciiTheme="majorHAnsi" w:eastAsiaTheme="majorEastAsia" w:hAnsiTheme="majorHAnsi" w:cstheme="majorBidi"/>
-          <w:color w:val="0F4761" w:themeColor="accent1" w:themeShade="BF"/>
-          <w:sz w:val="40"/>
-          <w:szCs w:val="40"/>
-        </w:rPr>
-      </w:pPr>
-    </w:p>
-    <w:p>
-      <w:pPr>
-        <w:spacing w:line="240" w:lineRule="auto"/>
-        <w:rPr>
-          <w:rFonts w:asciiTheme="majorHAnsi" w:eastAsiaTheme="majorEastAsia" w:hAnsiTheme="majorHAnsi" w:cstheme="majorBidi"/>
-          <w:color w:val="0F4761" w:themeColor="accent1" w:themeShade="BF"/>
-          <w:sz w:val="40"/>
-          <w:szCs w:val="40"/>
-        </w:rPr>
-      </w:pPr>
-    </w:p>
-    <w:p>
-      <w:pPr>
-        <w:spacing w:line="240" w:lineRule="auto"/>
-        <w:rPr>
-          <w:rFonts w:asciiTheme="majorHAnsi" w:eastAsiaTheme="majorEastAsia" w:hAnsiTheme="majorHAnsi" w:cstheme="majorBidi"/>
-          <w:color w:val="0F4761" w:themeColor="accent1" w:themeShade="BF"/>
-          <w:sz w:val="40"/>
-          <w:szCs w:val="40"/>
-        </w:rPr>
-      </w:pPr>
-    </w:p>
-    <w:p>
-      <w:pPr>
-        <w:spacing w:line="240" w:lineRule="auto"/>
-        <w:rPr>
-          <w:rFonts w:asciiTheme="majorHAnsi" w:eastAsiaTheme="majorEastAsia" w:hAnsiTheme="majorHAnsi" w:cstheme="majorBidi"/>
-          <w:color w:val="0F4761" w:themeColor="accent1" w:themeShade="BF"/>
-          <w:sz w:val="40"/>
-          <w:szCs w:val="40"/>
-        </w:rPr>
-      </w:pPr>
-      <w:r>
-        <w:rPr>
-          <w:rFonts w:asciiTheme="majorHAnsi" w:eastAsiaTheme="majorEastAsia" w:hAnsiTheme="majorHAnsi" w:cstheme="majorBidi"/>
-          <w:color w:val="0F4761" w:themeColor="accent1" w:themeShade="BF"/>
-          <w:sz w:val="40"/>
-          <w:szCs w:val="40"/>
-        </w:rPr>
+        <w:pStyle w:val="Heading1"/>
+      </w:pPr>
+      <w:proofErr w:type="spellStart"/>
+      <w:r>
+        <w:lastRenderedPageBreak/>
         <w:t>G</w:t>
       </w:r>
       <w:r>
-        <w:rPr>
-          <w:rFonts w:asciiTheme="majorHAnsi" w:eastAsiaTheme="majorEastAsia" w:hAnsiTheme="majorHAnsi" w:cstheme="majorBidi"/>
-          <w:color w:val="0F4761" w:themeColor="accent1" w:themeShade="BF"/>
-          <w:sz w:val="40"/>
-          <w:szCs w:val="40"/>
-        </w:rPr>
-        <w:t>of Participants</w:t>
+        <w:t>of</w:t>
+      </w:r>
+      <w:proofErr w:type="spellEnd"/>
+      <w:r>
+        <w:t xml:space="preserve"> Participants</w:t>
       </w:r>
     </w:p>
     <w:p>
@@ -785,25 +522,12 @@
           <w:p>
             <w:pPr>
               <w:spacing w:line="276" w:lineRule="auto"/>
-              <w:rPr>
-                <w:sz w:val="28"/>
-                <w:szCs w:val="28"/>
-              </w:rPr>
-            </w:pPr>
-            <w:r>
-              <w:rPr>
-                <w:sz w:val="28"/>
-                <w:szCs w:val="28"/>
-              </w:rPr>
-              <w:t>Building</w:t>
-            </w:r>
-            <w:r>
-              <w:rPr>
-                <w:sz w:val="28"/>
-                <w:szCs w:val="28"/>
-              </w:rPr>
-              <w:t>Facade</w:t>
-            </w:r>
+            </w:pPr>
+            <w:proofErr w:type="spellStart"/>
+            <w:r>
+              <w:t>BuildingFacade</w:t>
+            </w:r>
+            <w:proofErr w:type="spellEnd"/>
           </w:p>
         </w:tc>
       </w:tr>
@@ -838,25 +562,12 @@
           <w:p>
             <w:pPr>
               <w:spacing w:line="276" w:lineRule="auto"/>
-              <w:rPr>
-                <w:sz w:val="28"/>
-                <w:szCs w:val="28"/>
-              </w:rPr>
-            </w:pPr>
-            <w:r>
-              <w:rPr>
-                <w:sz w:val="28"/>
-                <w:szCs w:val="28"/>
-              </w:rPr>
-              <w:t>Buildin</w:t>
-            </w:r>
-            <w:r>
-              <w:rPr>
-                <w:sz w:val="28"/>
-                <w:szCs w:val="28"/>
-              </w:rPr>
-              <w:t>gCommand</w:t>
-            </w:r>
+            </w:pPr>
+            <w:proofErr w:type="spellStart"/>
+            <w:r>
+              <w:t>BuildingCommand</w:t>
+            </w:r>
+            <w:proofErr w:type="spellEnd"/>
           </w:p>
         </w:tc>
       </w:tr>
@@ -875,6 +586,7 @@
                 <w:szCs w:val="28"/>
               </w:rPr>
             </w:pPr>
+            <w:proofErr w:type="spellStart"/>
             <w:r>
               <w:rPr>
                 <w:b/>
@@ -882,43 +594,38 @@
               </w:rPr>
               <w:t>ConcreteCommand</w:t>
             </w:r>
-          </w:p>
-        </w:tc>
-        <w:tc>
-          <w:tcPr>
-            <w:tcW w:w="4508" w:type="dxa"/>
-          </w:tcPr>
-          <w:p>
-            <w:pPr>
-              <w:spacing w:line="276" w:lineRule="auto"/>
-              <w:rPr>
-                <w:sz w:val="28"/>
-                <w:szCs w:val="28"/>
-              </w:rPr>
-            </w:pPr>
-            <w:r>
-              <w:rPr>
-                <w:sz w:val="28"/>
-                <w:szCs w:val="28"/>
-              </w:rPr>
+            <w:proofErr w:type="spellEnd"/>
+          </w:p>
+        </w:tc>
+        <w:tc>
+          <w:tcPr>
+            <w:tcW w:w="4508" w:type="dxa"/>
+          </w:tcPr>
+          <w:p>
+            <w:pPr>
+              <w:spacing w:line="276" w:lineRule="auto"/>
+            </w:pPr>
+            <w:proofErr w:type="spellStart"/>
+            <w:r>
               <w:t>LockBuildingCommand</w:t>
             </w:r>
-            <w:r>
-              <w:rPr>
-                <w:sz w:val="28"/>
-                <w:szCs w:val="28"/>
-              </w:rPr>
+            <w:proofErr w:type="spellEnd"/>
+            <w:r>
               <w:br/>
+            </w:r>
+            <w:proofErr w:type="spellStart"/>
+            <w:r>
               <w:t>UnlockBuildingCommand</w:t>
             </w:r>
-            <w:r>
-              <w:rPr>
-                <w:sz w:val="28"/>
-                <w:szCs w:val="28"/>
-              </w:rPr>
+            <w:proofErr w:type="spellEnd"/>
+            <w:r>
               <w:br/>
+            </w:r>
+            <w:proofErr w:type="spellStart"/>
+            <w:r>
               <w:t>RestrictBuildingCommand</w:t>
             </w:r>
+            <w:proofErr w:type="spellEnd"/>
           </w:p>
         </w:tc>
       </w:tr>
@@ -953,18 +660,12 @@
           <w:p>
             <w:pPr>
               <w:spacing w:line="276" w:lineRule="auto"/>
-              <w:rPr>
-                <w:sz w:val="28"/>
-                <w:szCs w:val="28"/>
-              </w:rPr>
-            </w:pPr>
-            <w:r>
-              <w:rPr>
-                <w:sz w:val="28"/>
-                <w:szCs w:val="28"/>
-              </w:rPr>
+            </w:pPr>
+            <w:proofErr w:type="spellStart"/>
+            <w:r>
               <w:t>BuildingAccessInterface</w:t>
             </w:r>
+            <w:proofErr w:type="spellEnd"/>
           </w:p>
         </w:tc>
       </w:tr>
@@ -1040,9 +741,11 @@
             <w:pPr>
               <w:spacing w:line="276" w:lineRule="auto"/>
             </w:pPr>
+            <w:proofErr w:type="spellStart"/>
             <w:r>
               <w:t>StaffMediator</w:t>
             </w:r>
+            <w:proofErr w:type="spellEnd"/>
           </w:p>
         </w:tc>
       </w:tr>
@@ -1059,6 +762,7 @@
                 <w:bCs/>
               </w:rPr>
             </w:pPr>
+            <w:proofErr w:type="spellStart"/>
             <w:r>
               <w:rPr>
                 <w:b/>
@@ -1066,19 +770,22 @@
               </w:rPr>
               <w:t>ConcreteMediator</w:t>
             </w:r>
-          </w:p>
-        </w:tc>
-        <w:tc>
-          <w:tcPr>
-            <w:tcW w:w="4508" w:type="dxa"/>
-          </w:tcPr>
-          <w:p>
-            <w:pPr>
-              <w:spacing w:line="276" w:lineRule="auto"/>
-            </w:pPr>
+            <w:proofErr w:type="spellEnd"/>
+          </w:p>
+        </w:tc>
+        <w:tc>
+          <w:tcPr>
+            <w:tcW w:w="4508" w:type="dxa"/>
+          </w:tcPr>
+          <w:p>
+            <w:pPr>
+              <w:spacing w:line="276" w:lineRule="auto"/>
+            </w:pPr>
+            <w:proofErr w:type="spellStart"/>
             <w:r>
               <w:t>CampusEmergencyCoordinator</w:t>
             </w:r>
+            <w:proofErr w:type="spellEnd"/>
           </w:p>
         </w:tc>
       </w:tr>
@@ -1122,6 +829,7 @@
         <w:tc>
           <w:tcPr>
             <w:tcW w:w="4508" w:type="dxa"/>
+            <w:vMerge w:val="restart"/>
           </w:tcPr>
           <w:p>
             <w:pPr>
@@ -1131,6 +839,7 @@
                 <w:bCs/>
               </w:rPr>
             </w:pPr>
+            <w:proofErr w:type="spellStart"/>
             <w:r>
               <w:rPr>
                 <w:b/>
@@ -1138,19 +847,22 @@
               </w:rPr>
               <w:t>ConcreteColleague</w:t>
             </w:r>
-          </w:p>
-        </w:tc>
-        <w:tc>
-          <w:tcPr>
-            <w:tcW w:w="4508" w:type="dxa"/>
-          </w:tcPr>
-          <w:p>
-            <w:pPr>
-              <w:spacing w:line="276" w:lineRule="auto"/>
-            </w:pPr>
+            <w:proofErr w:type="spellEnd"/>
+          </w:p>
+        </w:tc>
+        <w:tc>
+          <w:tcPr>
+            <w:tcW w:w="4508" w:type="dxa"/>
+          </w:tcPr>
+          <w:p>
+            <w:pPr>
+              <w:spacing w:line="276" w:lineRule="auto"/>
+            </w:pPr>
+            <w:proofErr w:type="spellStart"/>
             <w:r>
               <w:t>SecurityService</w:t>
             </w:r>
+            <w:proofErr w:type="spellEnd"/>
           </w:p>
         </w:tc>
       </w:tr>
@@ -1158,24 +870,27 @@
         <w:tc>
           <w:tcPr>
             <w:tcW w:w="4508" w:type="dxa"/>
-          </w:tcPr>
-          <w:p>
-            <w:pPr>
-              <w:spacing w:line="276" w:lineRule="auto"/>
-            </w:pPr>
-          </w:p>
-        </w:tc>
-        <w:tc>
-          <w:tcPr>
-            <w:tcW w:w="4508" w:type="dxa"/>
-          </w:tcPr>
-          <w:p>
-            <w:pPr>
-              <w:spacing w:line="276" w:lineRule="auto"/>
-            </w:pPr>
+            <w:vMerge/>
+          </w:tcPr>
+          <w:p>
+            <w:pPr>
+              <w:spacing w:line="276" w:lineRule="auto"/>
+            </w:pPr>
+          </w:p>
+        </w:tc>
+        <w:tc>
+          <w:tcPr>
+            <w:tcW w:w="4508" w:type="dxa"/>
+          </w:tcPr>
+          <w:p>
+            <w:pPr>
+              <w:spacing w:line="276" w:lineRule="auto"/>
+            </w:pPr>
+            <w:proofErr w:type="spellStart"/>
             <w:r>
               <w:t>MedicalService</w:t>
             </w:r>
+            <w:proofErr w:type="spellEnd"/>
           </w:p>
         </w:tc>
       </w:tr>
@@ -1183,24 +898,27 @@
         <w:tc>
           <w:tcPr>
             <w:tcW w:w="4508" w:type="dxa"/>
-          </w:tcPr>
-          <w:p>
-            <w:pPr>
-              <w:spacing w:line="276" w:lineRule="auto"/>
-            </w:pPr>
-          </w:p>
-        </w:tc>
-        <w:tc>
-          <w:tcPr>
-            <w:tcW w:w="4508" w:type="dxa"/>
-          </w:tcPr>
-          <w:p>
-            <w:pPr>
-              <w:spacing w:line="276" w:lineRule="auto"/>
-            </w:pPr>
+            <w:vMerge/>
+          </w:tcPr>
+          <w:p>
+            <w:pPr>
+              <w:spacing w:line="276" w:lineRule="auto"/>
+            </w:pPr>
+          </w:p>
+        </w:tc>
+        <w:tc>
+          <w:tcPr>
+            <w:tcW w:w="4508" w:type="dxa"/>
+          </w:tcPr>
+          <w:p>
+            <w:pPr>
+              <w:spacing w:line="276" w:lineRule="auto"/>
+            </w:pPr>
+            <w:proofErr w:type="spellStart"/>
             <w:r>
               <w:t>FacilityService</w:t>
             </w:r>
+            <w:proofErr w:type="spellEnd"/>
           </w:p>
         </w:tc>
       </w:tr>
@@ -1208,24 +926,27 @@
         <w:tc>
           <w:tcPr>
             <w:tcW w:w="4508" w:type="dxa"/>
-          </w:tcPr>
-          <w:p>
-            <w:pPr>
-              <w:spacing w:line="276" w:lineRule="auto"/>
-            </w:pPr>
-          </w:p>
-        </w:tc>
-        <w:tc>
-          <w:tcPr>
-            <w:tcW w:w="4508" w:type="dxa"/>
-          </w:tcPr>
-          <w:p>
-            <w:pPr>
-              <w:spacing w:line="276" w:lineRule="auto"/>
-            </w:pPr>
+            <w:vMerge/>
+          </w:tcPr>
+          <w:p>
+            <w:pPr>
+              <w:spacing w:line="276" w:lineRule="auto"/>
+            </w:pPr>
+          </w:p>
+        </w:tc>
+        <w:tc>
+          <w:tcPr>
+            <w:tcW w:w="4508" w:type="dxa"/>
+          </w:tcPr>
+          <w:p>
+            <w:pPr>
+              <w:spacing w:line="276" w:lineRule="auto"/>
+            </w:pPr>
+            <w:proofErr w:type="spellStart"/>
             <w:r>
               <w:t>CommunicationService</w:t>
             </w:r>
+            <w:proofErr w:type="spellEnd"/>
           </w:p>
         </w:tc>
       </w:tr>
@@ -1300,18 +1021,12 @@
           <w:p>
             <w:pPr>
               <w:spacing w:line="276" w:lineRule="auto"/>
-              <w:rPr>
-                <w:sz w:val="28"/>
-                <w:szCs w:val="28"/>
-              </w:rPr>
-            </w:pPr>
-            <w:r>
-              <w:rPr>
-                <w:sz w:val="28"/>
-                <w:szCs w:val="28"/>
-              </w:rPr>
+            </w:pPr>
+            <w:proofErr w:type="spellStart"/>
+            <w:r>
               <w:t>BuildingAccessInterface</w:t>
             </w:r>
+            <w:proofErr w:type="spellEnd"/>
           </w:p>
         </w:tc>
       </w:tr>
@@ -1328,6 +1043,7 @@
                 <w:bCs/>
               </w:rPr>
             </w:pPr>
+            <w:proofErr w:type="spellStart"/>
             <w:r>
               <w:rPr>
                 <w:b/>
@@ -1335,27 +1051,22 @@
               </w:rPr>
               <w:t>Adaptee</w:t>
             </w:r>
-          </w:p>
-        </w:tc>
-        <w:tc>
-          <w:tcPr>
-            <w:tcW w:w="4508" w:type="dxa"/>
-          </w:tcPr>
-          <w:p>
-            <w:pPr>
-              <w:spacing w:line="276" w:lineRule="auto"/>
-              <w:rPr>
-                <w:sz w:val="28"/>
-                <w:szCs w:val="28"/>
-              </w:rPr>
-            </w:pPr>
-            <w:r>
-              <w:rPr>
-                <w:sz w:val="28"/>
-                <w:szCs w:val="28"/>
-              </w:rPr>
+            <w:proofErr w:type="spellEnd"/>
+          </w:p>
+        </w:tc>
+        <w:tc>
+          <w:tcPr>
+            <w:tcW w:w="4508" w:type="dxa"/>
+          </w:tcPr>
+          <w:p>
+            <w:pPr>
+              <w:spacing w:line="276" w:lineRule="auto"/>
+            </w:pPr>
+            <w:proofErr w:type="spellStart"/>
+            <w:r>
               <w:t>LegacyAccessSystem</w:t>
             </w:r>
+            <w:proofErr w:type="spellEnd"/>
           </w:p>
         </w:tc>
       </w:tr>
@@ -1377,7 +1088,6 @@
                 <w:b/>
                 <w:bCs/>
               </w:rPr>
-              <w:lastRenderedPageBreak/>
               <w:t>Adapter</w:t>
             </w:r>
           </w:p>
@@ -1389,33 +1099,16 @@
           <w:p>
             <w:pPr>
               <w:spacing w:line="276" w:lineRule="auto"/>
-              <w:rPr>
-                <w:sz w:val="28"/>
-                <w:szCs w:val="28"/>
-              </w:rPr>
-            </w:pPr>
-            <w:r>
-              <w:rPr>
-                <w:sz w:val="28"/>
-                <w:szCs w:val="28"/>
-              </w:rPr>
+            </w:pPr>
+            <w:proofErr w:type="spellStart"/>
+            <w:r>
               <w:t>BuildingAccessAdapter</w:t>
             </w:r>
+            <w:proofErr w:type="spellEnd"/>
           </w:p>
         </w:tc>
       </w:tr>
     </w:tbl>
-    <w:p>
-      <w:pPr>
-        <w:spacing w:line="276" w:lineRule="auto"/>
-        <w:rPr>
-          <w:b/>
-          <w:bCs/>
-          <w:sz w:val="28"/>
-          <w:szCs w:val="28"/>
-        </w:rPr>
-      </w:pPr>
-    </w:p>
     <w:p>
       <w:pPr>
         <w:spacing w:line="240" w:lineRule="auto"/>
@@ -1533,6 +1226,7 @@
         <w:tc>
           <w:tcPr>
             <w:tcW w:w="4508" w:type="dxa"/>
+            <w:vMerge w:val="restart"/>
           </w:tcPr>
           <w:p>
             <w:pPr>
@@ -1542,6 +1236,7 @@
                 <w:bCs/>
               </w:rPr>
             </w:pPr>
+            <w:proofErr w:type="spellStart"/>
             <w:r>
               <w:rPr>
                 <w:b/>
@@ -1549,6 +1244,7 @@
               </w:rPr>
               <w:t>ConcreteState</w:t>
             </w:r>
+            <w:proofErr w:type="spellEnd"/>
           </w:p>
         </w:tc>
         <w:tc>
@@ -1569,6 +1265,7 @@
         <w:tc>
           <w:tcPr>
             <w:tcW w:w="4508" w:type="dxa"/>
+            <w:vMerge/>
           </w:tcPr>
           <w:p>
             <w:pPr>
@@ -1588,9 +1285,11 @@
             <w:pPr>
               <w:spacing w:line="276" w:lineRule="auto"/>
             </w:pPr>
+            <w:proofErr w:type="spellStart"/>
             <w:r>
               <w:t>BeingWorkedOn</w:t>
             </w:r>
+            <w:proofErr w:type="spellEnd"/>
           </w:p>
         </w:tc>
       </w:tr>
@@ -1598,6 +1297,7 @@
         <w:tc>
           <w:tcPr>
             <w:tcW w:w="4508" w:type="dxa"/>
+            <w:vMerge/>
           </w:tcPr>
           <w:p>
             <w:pPr>
@@ -1617,9 +1317,11 @@
             <w:pPr>
               <w:spacing w:line="276" w:lineRule="auto"/>
             </w:pPr>
+            <w:proofErr w:type="spellStart"/>
             <w:r>
               <w:t>UnderControl</w:t>
             </w:r>
+            <w:proofErr w:type="spellEnd"/>
           </w:p>
         </w:tc>
       </w:tr>
@@ -1627,6 +1329,7 @@
         <w:tc>
           <w:tcPr>
             <w:tcW w:w="4508" w:type="dxa"/>
+            <w:vMerge/>
           </w:tcPr>
           <w:p>
             <w:pPr>
@@ -1664,16 +1367,6 @@
     </w:p>
     <w:p>
       <w:pPr>
-        <w:spacing w:line="276" w:lineRule="auto"/>
-        <w:rPr>
-          <w:b/>
-          <w:bCs/>
-        </w:rPr>
-      </w:pPr>
-    </w:p>
-    <w:p>
-      <w:pPr>
-        <w:spacing w:line="240" w:lineRule="auto"/>
         <w:rPr>
           <w:b/>
           <w:bCs/>
@@ -1688,6 +1381,27 @@
           <w:sz w:val="28"/>
           <w:szCs w:val="28"/>
         </w:rPr>
+        <w:br w:type="page"/>
+      </w:r>
+    </w:p>
+    <w:p>
+      <w:pPr>
+        <w:spacing w:line="240" w:lineRule="auto"/>
+        <w:rPr>
+          <w:b/>
+          <w:bCs/>
+          <w:sz w:val="28"/>
+          <w:szCs w:val="28"/>
+        </w:rPr>
+      </w:pPr>
+      <w:r>
+        <w:rPr>
+          <w:b/>
+          <w:bCs/>
+          <w:sz w:val="28"/>
+          <w:szCs w:val="28"/>
+        </w:rPr>
+        <w:lastRenderedPageBreak/>
         <w:t>OBSERVER</w:t>
       </w:r>
     </w:p>
@@ -1750,6 +1464,7 @@
                 <w:bCs/>
               </w:rPr>
             </w:pPr>
+            <w:proofErr w:type="spellStart"/>
             <w:r>
               <w:rPr>
                 <w:b/>
@@ -1757,6 +1472,7 @@
               </w:rPr>
               <w:t>ConcreteSubject</w:t>
             </w:r>
+            <w:proofErr w:type="spellEnd"/>
           </w:p>
         </w:tc>
         <w:tc>
@@ -1822,6 +1538,7 @@
                 <w:bCs/>
               </w:rPr>
             </w:pPr>
+            <w:proofErr w:type="spellStart"/>
             <w:r>
               <w:rPr>
                 <w:b/>
@@ -1829,19 +1546,22 @@
               </w:rPr>
               <w:t>ConcreteObserver</w:t>
             </w:r>
-          </w:p>
-        </w:tc>
-        <w:tc>
-          <w:tcPr>
-            <w:tcW w:w="4508" w:type="dxa"/>
-          </w:tcPr>
-          <w:p>
-            <w:pPr>
-              <w:spacing w:line="276" w:lineRule="auto"/>
-            </w:pPr>
+            <w:proofErr w:type="spellEnd"/>
+          </w:p>
+        </w:tc>
+        <w:tc>
+          <w:tcPr>
+            <w:tcW w:w="4508" w:type="dxa"/>
+          </w:tcPr>
+          <w:p>
+            <w:pPr>
+              <w:spacing w:line="276" w:lineRule="auto"/>
+            </w:pPr>
+            <w:proofErr w:type="spellStart"/>
             <w:r>
               <w:t>IncidentMangaer</w:t>
             </w:r>
+            <w:proofErr w:type="spellEnd"/>
           </w:p>
         </w:tc>
       </w:tr>
@@ -1917,6 +1637,7 @@
           </w:tcPr>
           <w:p>
             <w:pPr>
+              <w:spacing w:line="276" w:lineRule="auto"/>
               <w:rPr>
                 <w:rFonts w:asciiTheme="majorHAnsi" w:eastAsiaTheme="majorEastAsia" w:hAnsiTheme="majorHAnsi" w:cstheme="majorBidi"/>
                 <w:color w:val="0F4761" w:themeColor="accent1" w:themeShade="BF"/>
@@ -1924,25 +1645,19 @@
                 <w:szCs w:val="28"/>
               </w:rPr>
             </w:pPr>
-            <w:r>
-              <w:rPr>
-                <w:rFonts w:asciiTheme="majorHAnsi" w:eastAsiaTheme="majorEastAsia" w:hAnsiTheme="majorHAnsi" w:cstheme="majorBidi"/>
-                <w:color w:val="0F4761" w:themeColor="accent1" w:themeShade="BF"/>
-                <w:sz w:val="28"/>
-                <w:szCs w:val="28"/>
-              </w:rPr>
+            <w:proofErr w:type="spellStart"/>
+            <w:r>
               <w:t>CampusGuardFacade</w:t>
             </w:r>
-            <w:r>
-              <w:rPr>
-                <w:rFonts w:asciiTheme="majorHAnsi" w:eastAsiaTheme="majorEastAsia" w:hAnsiTheme="majorHAnsi" w:cstheme="majorBidi"/>
-                <w:color w:val="0F4761" w:themeColor="accent1" w:themeShade="BF"/>
-                <w:sz w:val="28"/>
-                <w:szCs w:val="28"/>
-              </w:rPr>
+            <w:proofErr w:type="spellEnd"/>
+            <w:r>
               <w:br/>
+            </w:r>
+            <w:proofErr w:type="spellStart"/>
+            <w:r>
               <w:t>BuildingFacade</w:t>
             </w:r>
+            <w:proofErr w:type="spellEnd"/>
           </w:p>
         </w:tc>
       </w:tr>
@@ -1960,208 +1675,57 @@
     </w:p>
     <w:p>
       <w:pPr>
-        <w:rPr>
-          <w:rFonts w:asciiTheme="majorHAnsi" w:eastAsiaTheme="majorEastAsia" w:hAnsiTheme="majorHAnsi" w:cstheme="majorBidi"/>
+        <w:pStyle w:val="Heading2"/>
+      </w:pPr>
+      <w:r>
+        <w:t>Team-selected patterns</w:t>
+      </w:r>
+    </w:p>
+    <w:p>
+      <w:pPr>
+        <w:spacing w:after="0" w:line="276" w:lineRule="auto"/>
+      </w:pPr>
+      <w:r>
+        <w:rPr>
           <w:b/>
           <w:bCs/>
-          <w:color w:val="0F4761" w:themeColor="accent1" w:themeShade="BF"/>
-          <w:sz w:val="32"/>
-          <w:szCs w:val="32"/>
-        </w:rPr>
-      </w:pPr>
-      <w:r>
-        <w:rPr>
-          <w:rFonts w:asciiTheme="majorHAnsi" w:eastAsiaTheme="majorEastAsia" w:hAnsiTheme="majorHAnsi" w:cstheme="majorBidi"/>
+        </w:rPr>
+        <w:t>State</w:t>
+      </w:r>
+      <w:r>
+        <w:t xml:space="preserve">: We used the State pattern to keep track of the condition of the incidents which </w:t>
+      </w:r>
+      <w:proofErr w:type="spellStart"/>
+      <w:r>
+        <w:t>CampusGuard</w:t>
+      </w:r>
+      <w:proofErr w:type="spellEnd"/>
+      <w:r>
+        <w:t xml:space="preserve"> manages and resolves.</w:t>
+      </w:r>
+    </w:p>
+    <w:p>
+      <w:pPr>
+        <w:spacing w:after="0" w:line="276" w:lineRule="auto"/>
+      </w:pPr>
+    </w:p>
+    <w:p>
+      <w:pPr>
+        <w:spacing w:line="276" w:lineRule="auto"/>
+      </w:pPr>
+      <w:r>
+        <w:rPr>
           <w:b/>
           <w:bCs/>
-          <w:color w:val="0F4761" w:themeColor="accent1" w:themeShade="BF"/>
-          <w:sz w:val="32"/>
-          <w:szCs w:val="32"/>
-        </w:rPr>
-        <w:t>Team-selected patterns</w:t>
-      </w:r>
-    </w:p>
-    <w:p>
-      <w:pPr>
-        <w:rPr>
-          <w:rFonts w:eastAsiaTheme="majorEastAsia" w:cstheme="majorBidi"/>
-          <w:color w:val="0F4761" w:themeColor="accent1" w:themeShade="BF"/>
-          <w:sz w:val="28"/>
-          <w:szCs w:val="28"/>
-        </w:rPr>
-      </w:pPr>
-      <w:r>
-        <w:rPr>
-          <w:rFonts w:eastAsiaTheme="majorEastAsia" w:cstheme="majorBidi"/>
-          <w:color w:val="0F4761" w:themeColor="accent1" w:themeShade="BF"/>
-          <w:sz w:val="28"/>
-          <w:szCs w:val="28"/>
-        </w:rPr>
-        <w:t>State</w:t>
-      </w:r>
-      <w:r>
-        <w:rPr>
-          <w:rFonts w:eastAsiaTheme="majorEastAsia" w:cstheme="majorBidi"/>
-          <w:b/>
-          <w:bCs/>
-          <w:color w:val="0F4761" w:themeColor="accent1" w:themeShade="BF"/>
-          <w:sz w:val="28"/>
-          <w:szCs w:val="28"/>
-        </w:rPr>
-        <w:t xml:space="preserve">: </w:t>
-      </w:r>
-      <w:r>
-        <w:rPr>
-          <w:rFonts w:eastAsiaTheme="majorEastAsia" w:cstheme="majorBidi"/>
-          <w:color w:val="0F4761" w:themeColor="accent1" w:themeShade="BF"/>
-          <w:sz w:val="28"/>
-          <w:szCs w:val="28"/>
-        </w:rPr>
-        <w:t>We used the State pattern to keep track of the condition of the incidents which CampusGuard manages and resolves.</w:t>
-      </w:r>
-    </w:p>
-    <w:p>
-      <w:pPr>
-        <w:rPr>
-          <w:rFonts w:eastAsiaTheme="majorEastAsia" w:cstheme="majorBidi"/>
-          <w:color w:val="0F4761" w:themeColor="accent1" w:themeShade="BF"/>
-          <w:sz w:val="28"/>
-          <w:szCs w:val="28"/>
-        </w:rPr>
-      </w:pPr>
-    </w:p>
-    <w:p>
-      <w:pPr>
-        <w:rPr>
-          <w:rFonts w:eastAsiaTheme="majorEastAsia" w:cstheme="majorBidi"/>
-          <w:color w:val="0F4761" w:themeColor="accent1" w:themeShade="BF"/>
-          <w:sz w:val="28"/>
-          <w:szCs w:val="28"/>
-        </w:rPr>
-      </w:pPr>
-      <w:r>
-        <w:rPr>
-          <w:rFonts w:eastAsiaTheme="majorEastAsia" w:cstheme="majorBidi"/>
-          <w:color w:val="0F4761" w:themeColor="accent1" w:themeShade="BF"/>
-          <w:sz w:val="28"/>
-          <w:szCs w:val="28"/>
-        </w:rPr>
-        <w:t>Observer: We used observer to keep track of the number of incidents currently being dealt with. There are a limited number of teams available to deal with the incidents, so when a team is finished with their incident it notifies the manager that they are now free so another may start being resolved.</w:t>
-      </w:r>
-    </w:p>
-    <w:p>
-      <w:pPr>
-        <w:rPr>
-          <w:rFonts w:eastAsiaTheme="majorEastAsia" w:cstheme="majorBidi"/>
-          <w:color w:val="0F4761" w:themeColor="accent1" w:themeShade="BF"/>
-          <w:sz w:val="28"/>
-          <w:szCs w:val="28"/>
-        </w:rPr>
-      </w:pPr>
-    </w:p>
-    <w:p>
-      <w:pPr>
-        <w:rPr>
-          <w:rFonts w:eastAsiaTheme="majorEastAsia" w:cstheme="majorBidi"/>
-          <w:color w:val="0F4761" w:themeColor="accent1" w:themeShade="BF"/>
-          <w:sz w:val="28"/>
-          <w:szCs w:val="28"/>
-        </w:rPr>
-      </w:pPr>
-    </w:p>
-    <w:p>
-      <w:pPr>
-        <w:rPr>
-          <w:rFonts w:eastAsiaTheme="majorEastAsia" w:cstheme="majorBidi"/>
-          <w:color w:val="0F4761" w:themeColor="accent1" w:themeShade="BF"/>
-          <w:sz w:val="28"/>
-          <w:szCs w:val="28"/>
-        </w:rPr>
-      </w:pPr>
-    </w:p>
-    <w:p>
-      <w:pPr>
-        <w:rPr>
-          <w:rFonts w:eastAsiaTheme="majorEastAsia" w:cstheme="majorBidi"/>
-          <w:color w:val="0F4761" w:themeColor="accent1" w:themeShade="BF"/>
-          <w:sz w:val="28"/>
-          <w:szCs w:val="28"/>
-        </w:rPr>
-      </w:pPr>
-    </w:p>
-    <w:p>
-      <w:pPr>
-        <w:rPr>
-          <w:rFonts w:eastAsiaTheme="majorEastAsia" w:cstheme="majorBidi"/>
-          <w:color w:val="0F4761" w:themeColor="accent1" w:themeShade="BF"/>
-          <w:sz w:val="28"/>
-          <w:szCs w:val="28"/>
-        </w:rPr>
-      </w:pPr>
-    </w:p>
-    <w:p>
-      <w:pPr>
-        <w:rPr>
-          <w:rFonts w:eastAsiaTheme="majorEastAsia" w:cstheme="majorBidi"/>
-          <w:color w:val="0F4761" w:themeColor="accent1" w:themeShade="BF"/>
-          <w:sz w:val="28"/>
-          <w:szCs w:val="28"/>
-        </w:rPr>
-      </w:pPr>
-    </w:p>
-    <w:p>
-      <w:pPr>
-        <w:rPr>
-          <w:rFonts w:eastAsiaTheme="majorEastAsia" w:cstheme="majorBidi"/>
-          <w:color w:val="0F4761" w:themeColor="accent1" w:themeShade="BF"/>
-          <w:sz w:val="28"/>
-          <w:szCs w:val="28"/>
-        </w:rPr>
-      </w:pPr>
-    </w:p>
-    <w:p>
-      <w:pPr>
-        <w:rPr>
-          <w:rFonts w:eastAsiaTheme="majorEastAsia" w:cstheme="majorBidi"/>
-          <w:color w:val="0F4761" w:themeColor="accent1" w:themeShade="BF"/>
-          <w:sz w:val="28"/>
-          <w:szCs w:val="28"/>
-        </w:rPr>
-      </w:pPr>
-    </w:p>
-    <w:p>
-      <w:pPr>
-        <w:rPr>
-          <w:rFonts w:eastAsiaTheme="majorEastAsia" w:cstheme="majorBidi"/>
-          <w:color w:val="0F4761" w:themeColor="accent1" w:themeShade="BF"/>
-          <w:sz w:val="28"/>
-          <w:szCs w:val="28"/>
-        </w:rPr>
-      </w:pPr>
-    </w:p>
-    <w:p>
-      <w:pPr>
-        <w:rPr>
-          <w:rFonts w:eastAsiaTheme="majorEastAsia" w:cstheme="majorBidi"/>
-          <w:color w:val="0F4761" w:themeColor="accent1" w:themeShade="BF"/>
-          <w:sz w:val="28"/>
-          <w:szCs w:val="28"/>
-        </w:rPr>
-      </w:pPr>
-    </w:p>
-    <w:p>
-      <w:pPr>
-        <w:rPr>
-          <w:rFonts w:eastAsiaTheme="majorEastAsia" w:cstheme="majorBidi"/>
-          <w:color w:val="0F4761" w:themeColor="accent1" w:themeShade="BF"/>
-          <w:sz w:val="28"/>
-          <w:szCs w:val="28"/>
-        </w:rPr>
-      </w:pPr>
-    </w:p>
-    <w:p>
-      <w:pPr>
-        <w:spacing w:line="240" w:lineRule="auto"/>
+        </w:rPr>
+        <w:t>Observer</w:t>
+      </w:r>
+      <w:r>
+        <w:t>: We used observer to keep track of the number of incidents currently being dealt with. There are a limited number of teams available to deal with the incidents, so when a team is finished with their incident it notifies the manager that they are now free so another may start being resolved.</w:t>
+      </w:r>
+    </w:p>
+    <w:p>
+      <w:pPr>
         <w:rPr>
           <w:rFonts w:asciiTheme="majorHAnsi" w:eastAsiaTheme="majorEastAsia" w:hAnsiTheme="majorHAnsi" w:cstheme="majorBidi"/>
           <w:color w:val="0F4761" w:themeColor="accent1" w:themeShade="BF"/>
@@ -2170,13 +1734,222 @@
         </w:rPr>
       </w:pPr>
       <w:r>
-        <w:rPr>
-          <w:rFonts w:asciiTheme="majorHAnsi" w:eastAsiaTheme="majorEastAsia" w:hAnsiTheme="majorHAnsi" w:cstheme="majorBidi"/>
+        <w:br w:type="page"/>
+      </w:r>
+    </w:p>
+    <w:p>
+      <w:pPr>
+        <w:pStyle w:val="Heading1"/>
+      </w:pPr>
+      <w:r>
+        <w:lastRenderedPageBreak/>
+        <w:t>Behavioural Diagrams</w:t>
+      </w:r>
+    </w:p>
+    <w:p>
+      <w:pPr>
+        <w:rPr>
+          <w:rFonts w:asciiTheme="majorHAnsi" w:hAnsiTheme="majorHAnsi" w:cstheme="majorBidi"/>
           <w:color w:val="0F4761" w:themeColor="accent1" w:themeShade="BF"/>
           <w:sz w:val="40"/>
           <w:szCs w:val="40"/>
         </w:rPr>
-        <w:t xml:space="preserve">Gdb </w:t>
+      </w:pPr>
+      <w:r>
+        <w:br w:type="page"/>
+      </w:r>
+    </w:p>
+    <w:p>
+      <w:pPr>
+        <w:pStyle w:val="Heading1"/>
+        <w:rPr>
+          <w:rFonts w:eastAsiaTheme="minorHAnsi"/>
+        </w:rPr>
+      </w:pPr>
+      <w:r>
+        <w:rPr>
+          <w:rFonts w:eastAsiaTheme="minorHAnsi"/>
+        </w:rPr>
+        <w:lastRenderedPageBreak/>
+        <w:t>Design Rationale</w:t>
+      </w:r>
+    </w:p>
+    <w:p>
+      <w:pPr>
+        <w:pStyle w:val="ListParagraph"/>
+        <w:numPr>
+          <w:ilvl w:val="0"/>
+          <w:numId w:val="3"/>
+        </w:numPr>
+        <w:spacing w:line="240" w:lineRule="auto"/>
+      </w:pPr>
+      <w:r>
+        <w:t>We used a mediator for staff coordination, so that each colleague communicates through a central</w:t>
+      </w:r>
+      <w:r>
+        <w:t>ized</w:t>
+      </w:r>
+      <w:r>
+        <w:t xml:space="preserve"> party in </w:t>
+      </w:r>
+      <w:r>
+        <w:t>an emergency</w:t>
+      </w:r>
+      <w:r>
+        <w:t>. If not used each colleague would have to contain a pointer to each other, making it complex and increasing coupling.</w:t>
+      </w:r>
+    </w:p>
+    <w:p>
+      <w:pPr>
+        <w:pStyle w:val="ListParagraph"/>
+        <w:numPr>
+          <w:ilvl w:val="0"/>
+          <w:numId w:val="3"/>
+        </w:numPr>
+        <w:spacing w:line="240" w:lineRule="auto"/>
+      </w:pPr>
+      <w:r>
+        <w:t xml:space="preserve">Two-level Facade: </w:t>
+      </w:r>
+      <w:proofErr w:type="spellStart"/>
+      <w:r>
+        <w:t>B</w:t>
+      </w:r>
+      <w:r>
+        <w:t>uilding</w:t>
+      </w:r>
+      <w:r>
+        <w:t>F</w:t>
+      </w:r>
+      <w:r>
+        <w:t>acade</w:t>
+      </w:r>
+      <w:proofErr w:type="spellEnd"/>
+      <w:r>
+        <w:t xml:space="preserve"> hide</w:t>
+      </w:r>
+      <w:r>
+        <w:t>s</w:t>
+      </w:r>
+      <w:r>
+        <w:t xml:space="preserve"> the Command/Adapter/State chain, while </w:t>
+      </w:r>
+      <w:proofErr w:type="spellStart"/>
+      <w:r>
+        <w:t>CampusGuardFacade</w:t>
+      </w:r>
+      <w:proofErr w:type="spellEnd"/>
+      <w:r>
+        <w:t xml:space="preserve"> </w:t>
+      </w:r>
+      <w:r>
+        <w:t>keeps track of every building and can efficiently coordinate a mass evacuation or lockdown of every building on the campus</w:t>
+      </w:r>
+      <w:r>
+        <w:t>.</w:t>
+      </w:r>
+    </w:p>
+    <w:p>
+      <w:pPr>
+        <w:pStyle w:val="ListParagraph"/>
+        <w:numPr>
+          <w:ilvl w:val="0"/>
+          <w:numId w:val="3"/>
+        </w:numPr>
+        <w:spacing w:line="240" w:lineRule="auto"/>
+      </w:pPr>
+      <w:r>
+        <w:t>Ownership</w:t>
+      </w:r>
+    </w:p>
+    <w:p>
+      <w:pPr>
+        <w:pStyle w:val="ListParagraph"/>
+        <w:numPr>
+          <w:ilvl w:val="1"/>
+          <w:numId w:val="3"/>
+        </w:numPr>
+        <w:spacing w:line="240" w:lineRule="auto"/>
+      </w:pPr>
+      <w:proofErr w:type="spellStart"/>
+      <w:r>
+        <w:t>BuildingAccessInterface</w:t>
+      </w:r>
+      <w:proofErr w:type="spellEnd"/>
+      <w:r>
+        <w:t xml:space="preserve"> has a compositional relationship with State and is responsible for deallocating </w:t>
+      </w:r>
+      <w:r>
+        <w:t>its</w:t>
+      </w:r>
+      <w:r>
+        <w:t xml:space="preserve"> memory.</w:t>
+      </w:r>
+    </w:p>
+    <w:p>
+      <w:pPr>
+        <w:pStyle w:val="ListParagraph"/>
+        <w:numPr>
+          <w:ilvl w:val="1"/>
+          <w:numId w:val="3"/>
+        </w:numPr>
+        <w:spacing w:line="240" w:lineRule="auto"/>
+      </w:pPr>
+      <w:proofErr w:type="spellStart"/>
+      <w:r>
+        <w:t>BuildingFacade</w:t>
+      </w:r>
+      <w:proofErr w:type="spellEnd"/>
+      <w:r>
+        <w:t xml:space="preserve"> has an </w:t>
+      </w:r>
+      <w:proofErr w:type="spellStart"/>
+      <w:r>
+        <w:t>aggregatinonal</w:t>
+      </w:r>
+      <w:proofErr w:type="spellEnd"/>
+      <w:r>
+        <w:t xml:space="preserve"> relationship with </w:t>
+      </w:r>
+      <w:proofErr w:type="spellStart"/>
+      <w:r>
+        <w:t>CampusGuard</w:t>
+      </w:r>
+      <w:proofErr w:type="spellEnd"/>
+      <w:r>
+        <w:t xml:space="preserve">. This is to allow the user to choose whether to use the façade or directly interact with the </w:t>
+      </w:r>
+      <w:proofErr w:type="spellStart"/>
+      <w:r>
+        <w:t>BuildingFacade</w:t>
+      </w:r>
+      <w:proofErr w:type="spellEnd"/>
+      <w:r>
+        <w:t>. This also allows for scalability, meaning this system can work for an individual building only as well</w:t>
+      </w:r>
+    </w:p>
+    <w:p>
+      <w:pPr>
+        <w:pStyle w:val="Heading1"/>
+      </w:pPr>
+      <w:proofErr w:type="spellStart"/>
+      <w:r>
+        <w:t>Gdb</w:t>
+      </w:r>
+      <w:proofErr w:type="spellEnd"/>
+      <w:r>
+        <w:t xml:space="preserve"> Evidence</w:t>
+      </w:r>
+      <w:r>
+        <w:t xml:space="preserve"> </w:t>
+      </w:r>
+    </w:p>
+    <w:p>
+      <w:pPr>
+        <w:pStyle w:val="Heading3"/>
+      </w:pPr>
+      <w:r>
+        <w:t>#1</w:t>
       </w:r>
     </w:p>
     <w:p>
@@ -2189,6 +1962,11 @@
     </w:p>
     <w:p>
       <w:pPr>
+        <w:pStyle w:val="ListParagraph"/>
+        <w:numPr>
+          <w:ilvl w:val="0"/>
+          <w:numId w:val="4"/>
+        </w:numPr>
         <w:spacing w:line="240" w:lineRule="auto"/>
       </w:pPr>
       <w:r>
@@ -2199,27 +1977,40 @@
       <w:pPr>
         <w:spacing w:line="240" w:lineRule="auto"/>
       </w:pPr>
-    </w:p>
-    <w:p>
-      <w:pPr>
-        <w:spacing w:line="240" w:lineRule="auto"/>
-      </w:pPr>
       <w:r>
         <w:t>Location:</w:t>
       </w:r>
     </w:p>
     <w:p>
       <w:pPr>
-        <w:spacing w:line="240" w:lineRule="auto"/>
-      </w:pPr>
-      <w:r>
-        <w:t>BuildingAccessInterface::setState()</w:t>
-      </w:r>
-    </w:p>
-    <w:p>
-      <w:pPr>
-        <w:spacing w:line="240" w:lineRule="auto"/>
-      </w:pPr>
+        <w:pStyle w:val="ListParagraph"/>
+        <w:numPr>
+          <w:ilvl w:val="0"/>
+          <w:numId w:val="4"/>
+        </w:numPr>
+        <w:spacing w:line="240" w:lineRule="auto"/>
+      </w:pPr>
+      <w:proofErr w:type="spellStart"/>
+      <w:proofErr w:type="gramStart"/>
+      <w:r>
+        <w:t>BuildingAccessInterface</w:t>
+      </w:r>
+      <w:proofErr w:type="spellEnd"/>
+      <w:r>
+        <w:t>::</w:t>
+      </w:r>
+      <w:proofErr w:type="spellStart"/>
+      <w:r>
+        <w:t>setState</w:t>
+      </w:r>
+      <w:proofErr w:type="spellEnd"/>
+      <w:r>
+        <w:t>(</w:t>
+      </w:r>
+      <w:proofErr w:type="gramEnd"/>
+      <w:r>
+        <w:t>)</w:t>
+      </w:r>
     </w:p>
     <w:p>
       <w:pPr>
@@ -2231,16 +2022,27 @@
     </w:p>
     <w:p>
       <w:pPr>
-        <w:spacing w:line="240" w:lineRule="auto"/>
-      </w:pPr>
-      <w:r>
-        <w:t>Commands contained duplicate accessSystem pointers,</w:t>
-      </w:r>
-    </w:p>
-    <w:p>
-      <w:pPr>
-        <w:spacing w:line="240" w:lineRule="auto"/>
-      </w:pPr>
+        <w:pStyle w:val="ListParagraph"/>
+        <w:numPr>
+          <w:ilvl w:val="0"/>
+          <w:numId w:val="4"/>
+        </w:numPr>
+        <w:spacing w:line="240" w:lineRule="auto"/>
+      </w:pPr>
+      <w:r>
+        <w:t xml:space="preserve">Commands contained duplicate </w:t>
+      </w:r>
+      <w:proofErr w:type="spellStart"/>
+      <w:r>
+        <w:t>accessSystem</w:t>
+      </w:r>
+      <w:proofErr w:type="spellEnd"/>
+      <w:r>
+        <w:t xml:space="preserve"> pointers,</w:t>
+      </w:r>
+      <w:r>
+        <w:t xml:space="preserve"> </w:t>
+      </w:r>
       <w:r>
         <w:t>hiding the initialized base-class pointer.</w:t>
       </w:r>
@@ -2249,27 +2051,33 @@
       <w:pPr>
         <w:spacing w:line="240" w:lineRule="auto"/>
       </w:pPr>
-    </w:p>
-    <w:p>
-      <w:pPr>
-        <w:spacing w:line="240" w:lineRule="auto"/>
-      </w:pPr>
       <w:r>
         <w:t>Fix:</w:t>
       </w:r>
     </w:p>
     <w:p>
       <w:pPr>
-        <w:spacing w:line="240" w:lineRule="auto"/>
-      </w:pPr>
-      <w:r>
-        <w:t>Removed duplicate accessSystem members</w:t>
-      </w:r>
-    </w:p>
-    <w:p>
-      <w:pPr>
-        <w:spacing w:line="240" w:lineRule="auto"/>
-      </w:pPr>
+        <w:pStyle w:val="ListParagraph"/>
+        <w:numPr>
+          <w:ilvl w:val="0"/>
+          <w:numId w:val="4"/>
+        </w:numPr>
+        <w:spacing w:line="240" w:lineRule="auto"/>
+      </w:pPr>
+      <w:r>
+        <w:t xml:space="preserve">Removed duplicate </w:t>
+      </w:r>
+      <w:proofErr w:type="spellStart"/>
+      <w:r>
+        <w:t>accessSystem</w:t>
+      </w:r>
+      <w:proofErr w:type="spellEnd"/>
+      <w:r>
+        <w:t xml:space="preserve"> members</w:t>
+      </w:r>
+      <w:r>
+        <w:t xml:space="preserve"> </w:t>
+      </w:r>
       <w:r>
         <w:t>from Lock/Unlock/Restrict commands.</w:t>
       </w:r>
@@ -2284,10 +2092,24 @@
     </w:p>
     <w:p>
       <w:pPr>
-        <w:spacing w:line="240" w:lineRule="auto"/>
-      </w:pPr>
-      <w:r>
-        <w:t>104 bytes definitely lost in 13 blocks.</w:t>
+        <w:pStyle w:val="ListParagraph"/>
+        <w:numPr>
+          <w:ilvl w:val="0"/>
+          <w:numId w:val="4"/>
+        </w:numPr>
+        <w:spacing w:line="240" w:lineRule="auto"/>
+      </w:pPr>
+      <w:r>
+        <w:t>“</w:t>
+      </w:r>
+      <w:r>
+        <w:t>104 bytes definitely lost in 13 blocks</w:t>
+      </w:r>
+      <w:r>
+        <w:t>”</w:t>
+      </w:r>
+      <w:r>
+        <w:t>.</w:t>
       </w:r>
     </w:p>
     <w:p>
@@ -2300,7 +2122,7 @@
         </w:rPr>
         <w:lastRenderedPageBreak/>
         <w:drawing>
-          <wp:inline distT="0" distB="0" distL="0" distR="0" wp14:anchorId="1D9AB8EA" wp14:editId="361F5990">
+          <wp:inline distT="0" distB="0" distL="0" distR="0" wp14:anchorId="1D9AB8EA" wp14:editId="7B6C25E9">
             <wp:extent cx="6057690" cy="2175933"/>
             <wp:effectExtent l="0" t="0" r="635" b="0"/>
             <wp:docPr id="1485024030" name="Picture 1"/>
@@ -2358,7 +2180,7 @@
           <w:noProof/>
         </w:rPr>
         <w:drawing>
-          <wp:inline distT="0" distB="0" distL="0" distR="0" wp14:anchorId="57959CA9" wp14:editId="6DA6E155">
+          <wp:inline distT="0" distB="0" distL="0" distR="0" wp14:anchorId="57959CA9" wp14:editId="0831D95B">
             <wp:extent cx="5181600" cy="2722925"/>
             <wp:effectExtent l="0" t="0" r="0" b="1270"/>
             <wp:docPr id="1715487094" name="Picture 2"/>
@@ -2414,10 +2236,10 @@
     </w:p>
     <w:p>
       <w:pPr>
-        <w:pStyle w:val="Heading1"/>
-      </w:pPr>
-      <w:r>
-        <w:t>Gdb Use</w:t>
+        <w:pStyle w:val="Heading3"/>
+      </w:pPr>
+      <w:r>
+        <w:t>#2</w:t>
       </w:r>
     </w:p>
     <w:p>
@@ -2546,7 +2368,15 @@
     </w:p>
     <w:p>
       <w:r>
-        <w:t>Person wasn’t showing up. Then we realised that it must’ve went out of scope, since it was created in an if statement, so gdb couldn’t see it, so we went and scanned the code, and saw we had not deallocated its memory, and did so.</w:t>
+        <w:t xml:space="preserve">Person wasn’t showing up. Then we realised that it must’ve went out of scope, since it was created in an if statement, so </w:t>
+      </w:r>
+      <w:proofErr w:type="spellStart"/>
+      <w:r>
+        <w:t>gdb</w:t>
+      </w:r>
+      <w:proofErr w:type="spellEnd"/>
+      <w:r>
+        <w:t xml:space="preserve"> couldn’t see it, so we went and scanned the code, and saw we had not deallocated its memory, and did so.</w:t>
       </w:r>
     </w:p>
     <w:p>
@@ -2656,32 +2486,14 @@
     </w:p>
     <w:p>
       <w:pPr>
-        <w:spacing w:line="240" w:lineRule="auto"/>
-      </w:pPr>
-    </w:p>
-    <w:p>
-      <w:pPr>
-        <w:spacing w:line="240" w:lineRule="auto"/>
-      </w:pPr>
-    </w:p>
-    <w:p>
-      <w:pPr>
-        <w:spacing w:line="240" w:lineRule="auto"/>
-        <w:rPr>
-          <w:rFonts w:asciiTheme="majorHAnsi" w:eastAsiaTheme="majorEastAsia" w:hAnsiTheme="majorHAnsi" w:cstheme="majorBidi"/>
-          <w:color w:val="0F4761" w:themeColor="accent1" w:themeShade="BF"/>
-          <w:sz w:val="40"/>
-          <w:szCs w:val="40"/>
-        </w:rPr>
-      </w:pPr>
-      <w:r>
-        <w:rPr>
-          <w:rFonts w:asciiTheme="majorHAnsi" w:eastAsiaTheme="majorEastAsia" w:hAnsiTheme="majorHAnsi" w:cstheme="majorBidi"/>
-          <w:color w:val="0F4761" w:themeColor="accent1" w:themeShade="BF"/>
-          <w:sz w:val="40"/>
-          <w:szCs w:val="40"/>
-        </w:rPr>
-        <w:t>VALGRIND</w:t>
+        <w:pStyle w:val="Heading1"/>
+      </w:pPr>
+      <w:r>
+        <w:lastRenderedPageBreak/>
+        <w:t>Valgrind</w:t>
+      </w:r>
+      <w:r>
+        <w:t xml:space="preserve"> Evidence</w:t>
       </w:r>
     </w:p>
     <w:p>
@@ -2714,8 +2526,16 @@
     <w:p>
       <w:pPr>
         <w:spacing w:line="240" w:lineRule="auto"/>
-      </w:pPr>
-      <w:r>
+        <w:rPr>
+          <w:b/>
+          <w:bCs/>
+        </w:rPr>
+      </w:pPr>
+      <w:r>
+        <w:rPr>
+          <w:b/>
+          <w:bCs/>
+        </w:rPr>
         <w:t>Fixes:</w:t>
       </w:r>
     </w:p>
@@ -2732,7 +2552,23 @@
         <w:spacing w:line="240" w:lineRule="auto"/>
       </w:pPr>
       <w:r>
-        <w:t>- Deleted previous state in Incident::setCondition().</w:t>
+        <w:t xml:space="preserve">- Deleted previous state in </w:t>
+      </w:r>
+      <w:proofErr w:type="gramStart"/>
+      <w:r>
+        <w:t>Incident::</w:t>
+      </w:r>
+      <w:proofErr w:type="spellStart"/>
+      <w:r>
+        <w:t>setCondition</w:t>
+      </w:r>
+      <w:proofErr w:type="spellEnd"/>
+      <w:r>
+        <w:t>(</w:t>
+      </w:r>
+      <w:proofErr w:type="gramEnd"/>
+      <w:r>
+        <w:t>).</w:t>
       </w:r>
     </w:p>
     <w:p>
@@ -2748,28 +2584,61 @@
         <w:spacing w:line="240" w:lineRule="auto"/>
       </w:pPr>
       <w:r>
-        <w:t>- Added BuildingAccessInterface destructor to release</w:t>
-      </w:r>
-    </w:p>
-    <w:p>
-      <w:pPr>
-        <w:spacing w:line="240" w:lineRule="auto"/>
-      </w:pPr>
-      <w:r>
-        <w:t>the final BuildingState object.</w:t>
-      </w:r>
-    </w:p>
-    <w:p>
-      <w:pPr>
-        <w:spacing w:line="240" w:lineRule="auto"/>
-      </w:pPr>
-    </w:p>
-    <w:p>
-      <w:pPr>
-        <w:spacing w:line="240" w:lineRule="auto"/>
-      </w:pPr>
-      <w:r>
-        <w:t>Final result:</w:t>
+        <w:t xml:space="preserve">- Added </w:t>
+      </w:r>
+      <w:proofErr w:type="spellStart"/>
+      <w:r>
+        <w:t>BuildingAccessInterface</w:t>
+      </w:r>
+      <w:proofErr w:type="spellEnd"/>
+      <w:r>
+        <w:t xml:space="preserve"> destructor to release</w:t>
+      </w:r>
+    </w:p>
+    <w:p>
+      <w:pPr>
+        <w:spacing w:line="240" w:lineRule="auto"/>
+      </w:pPr>
+      <w:r>
+        <w:t xml:space="preserve">the final </w:t>
+      </w:r>
+      <w:proofErr w:type="spellStart"/>
+      <w:r>
+        <w:t>BuildingState</w:t>
+      </w:r>
+      <w:proofErr w:type="spellEnd"/>
+      <w:r>
+        <w:t xml:space="preserve"> object.</w:t>
+      </w:r>
+    </w:p>
+    <w:p>
+      <w:pPr>
+        <w:spacing w:line="240" w:lineRule="auto"/>
+      </w:pPr>
+    </w:p>
+    <w:p>
+      <w:pPr>
+        <w:spacing w:line="240" w:lineRule="auto"/>
+        <w:rPr>
+          <w:b/>
+          <w:bCs/>
+        </w:rPr>
+      </w:pPr>
+      <w:proofErr w:type="gramStart"/>
+      <w:r>
+        <w:rPr>
+          <w:b/>
+          <w:bCs/>
+        </w:rPr>
+        <w:t>Final result</w:t>
+      </w:r>
+      <w:proofErr w:type="gramEnd"/>
+      <w:r>
+        <w:rPr>
+          <w:b/>
+          <w:bCs/>
+        </w:rPr>
+        <w:t>:</w:t>
       </w:r>
     </w:p>
     <w:p>
@@ -2846,7 +2715,7 @@
         </w:rPr>
         <w:lastRenderedPageBreak/>
         <w:drawing>
-          <wp:inline distT="0" distB="0" distL="0" distR="0" wp14:anchorId="0DBD22B2" wp14:editId="2541F027">
+          <wp:inline distT="0" distB="0" distL="0" distR="0" wp14:anchorId="0DBD22B2" wp14:editId="1BB19F1D">
             <wp:extent cx="5715000" cy="2997200"/>
             <wp:effectExtent l="0" t="0" r="0" b="0"/>
             <wp:docPr id="1989881974" name="Picture 4"/>
@@ -2901,7 +2770,7 @@
           <w:noProof/>
         </w:rPr>
         <w:drawing>
-          <wp:inline distT="0" distB="0" distL="0" distR="0" wp14:anchorId="1DA3A170" wp14:editId="61C387E9">
+          <wp:inline distT="0" distB="0" distL="0" distR="0" wp14:anchorId="1DA3A170" wp14:editId="0A19D29E">
             <wp:extent cx="5727700" cy="3060700"/>
             <wp:effectExtent l="0" t="0" r="6350" b="6350"/>
             <wp:docPr id="1528522615" name="Picture 5"/>
@@ -3033,9 +2902,9 @@
 <file path=word/numbering.xml><?xml version="1.0" encoding="utf-8"?>
 <w:numbering xmlns:wpc="http://schemas.microsoft.com/office/word/2010/wordprocessingCanvas" xmlns:cx="http://schemas.microsoft.com/office/drawing/2014/chartex" xmlns:cx1="http://schemas.microsoft.com/office/drawing/2015/9/8/chartex" xmlns:cx2="http://schemas.microsoft.com/office/drawing/2015/10/21/chartex" xmlns:cx3="http://schemas.microsoft.com/office/drawing/2016/5/9/chartex" xmlns:cx4="http://schemas.microsoft.com/office/drawing/2016/5/10/chartex" xmlns:cx5="http://schemas.microsoft.com/office/drawing/2016/5/11/chartex" xmlns:cx6="http://schemas.microsoft.com/office/drawing/2016/5/12/chartex" xmlns:cx7="http://schemas.microsoft.com/office/drawing/2016/5/13/chartex" xmlns:cx8="http://schemas.microsoft.com/office/drawing/2016/5/14/chartex" xmlns:mc="http://schemas.openxmlformats.org/markup-compatibility/2006" xmlns:aink="http://schemas.microsoft.com/office/drawing/2016/ink" xmlns:am3d="http://schemas.microsoft.com/office/drawing/2017/model3d" xmlns:o="urn:schemas-microsoft-com:office:office" xmlns:oel="http://schemas.microsoft.com/office/2019/extlst" xmlns:r="http://schemas.openxmlformats.org/officeDocument/2006/relationships" xmlns:m="http://schemas.openxmlformats.org/officeDocument/2006/math" xmlns:v="urn:schemas-microsoft-com:vml" xmlns:wp14="http://schemas.microsoft.com/office/word/2010/wordprocessingDrawing" xmlns:wp="http://schemas.openxmlformats.org/drawingml/2006/wordprocessingDrawing" xmlns:w10="urn:schemas-microsoft-com:office:word" xmlns:w="http://schemas.openxmlformats.org/wordprocessingml/2006/main" xmlns:w14="http://schemas.microsoft.com/office/word/2010/wordml" xmlns:w15="http://schemas.microsoft.com/office/word/2012/wordml" xmlns:w16cex="http://schemas.microsoft.com/office/word/2018/wordml/cex" xmlns:w16cid="http://schemas.microsoft.com/office/word/2016/wordml/cid" xmlns:w16="http://schemas.microsoft.com/office/word/2018/wordml" xmlns:w16du="http://schemas.microsoft.com/office/word/2023/wordml/word16du" xmlns:w16sdtdh="http://schemas.microsoft.com/office/word/2020/wordml/sdtdatahash" xmlns:w16sdtfl="http://schemas.microsoft.com/office/word/2024/wordml/sdtformatlock" xmlns:w16se="http://schemas.microsoft.com/office/word/2015/wordml/symex" xmlns:wpg="http://schemas.microsoft.com/office/word/2010/wordprocessingGroup" xmlns:wpi="http://schemas.microsoft.com/office/word/2010/wordprocessingInk" xmlns:wne="http://schemas.microsoft.com/office/word/2006/wordml" xmlns:wps="http://schemas.microsoft.com/office/word/2010/wordprocessingShape" mc:Ignorable="w14 w15 w16se w16cid w16 w16cex w16sdtdh w16sdtfl w16du wp14">
   <w:abstractNum w:abstractNumId="0" w15:restartNumberingAfterBreak="0">
-    <w:nsid w:val="5CA73F46"/>
+    <w:nsid w:val="0D040A11"/>
     <w:multiLevelType w:val="hybridMultilevel"/>
-    <w:tmpl w:val="2AEAB690"/>
+    <w:tmpl w:val="CB949908"/>
     <w:lvl w:ilvl="0" w:tplc="1C090001">
       <w:start w:val="1"/>
       <w:numFmt w:val="bullet"/>
@@ -3145,8 +3014,356 @@
       </w:rPr>
     </w:lvl>
   </w:abstractNum>
+  <w:abstractNum w:abstractNumId="1" w15:restartNumberingAfterBreak="0">
+    <w:nsid w:val="2F2D0B87"/>
+    <w:multiLevelType w:val="hybridMultilevel"/>
+    <w:tmpl w:val="3C644226"/>
+    <w:lvl w:ilvl="0" w:tplc="1C090001">
+      <w:start w:val="1"/>
+      <w:numFmt w:val="bullet"/>
+      <w:lvlText w:val=""/>
+      <w:lvlJc w:val="left"/>
+      <w:pPr>
+        <w:ind w:left="720" w:hanging="360"/>
+      </w:pPr>
+      <w:rPr>
+        <w:rFonts w:ascii="Symbol" w:hAnsi="Symbol" w:hint="default"/>
+      </w:rPr>
+    </w:lvl>
+    <w:lvl w:ilvl="1" w:tplc="1C090003">
+      <w:start w:val="1"/>
+      <w:numFmt w:val="bullet"/>
+      <w:lvlText w:val="o"/>
+      <w:lvlJc w:val="left"/>
+      <w:pPr>
+        <w:ind w:left="1440" w:hanging="360"/>
+      </w:pPr>
+      <w:rPr>
+        <w:rFonts w:ascii="Courier New" w:hAnsi="Courier New" w:cs="Courier New" w:hint="default"/>
+      </w:rPr>
+    </w:lvl>
+    <w:lvl w:ilvl="2" w:tplc="1C090005" w:tentative="1">
+      <w:start w:val="1"/>
+      <w:numFmt w:val="bullet"/>
+      <w:lvlText w:val=""/>
+      <w:lvlJc w:val="left"/>
+      <w:pPr>
+        <w:ind w:left="2160" w:hanging="360"/>
+      </w:pPr>
+      <w:rPr>
+        <w:rFonts w:ascii="Wingdings" w:hAnsi="Wingdings" w:hint="default"/>
+      </w:rPr>
+    </w:lvl>
+    <w:lvl w:ilvl="3" w:tplc="1C090001" w:tentative="1">
+      <w:start w:val="1"/>
+      <w:numFmt w:val="bullet"/>
+      <w:lvlText w:val=""/>
+      <w:lvlJc w:val="left"/>
+      <w:pPr>
+        <w:ind w:left="2880" w:hanging="360"/>
+      </w:pPr>
+      <w:rPr>
+        <w:rFonts w:ascii="Symbol" w:hAnsi="Symbol" w:hint="default"/>
+      </w:rPr>
+    </w:lvl>
+    <w:lvl w:ilvl="4" w:tplc="1C090003" w:tentative="1">
+      <w:start w:val="1"/>
+      <w:numFmt w:val="bullet"/>
+      <w:lvlText w:val="o"/>
+      <w:lvlJc w:val="left"/>
+      <w:pPr>
+        <w:ind w:left="3600" w:hanging="360"/>
+      </w:pPr>
+      <w:rPr>
+        <w:rFonts w:ascii="Courier New" w:hAnsi="Courier New" w:cs="Courier New" w:hint="default"/>
+      </w:rPr>
+    </w:lvl>
+    <w:lvl w:ilvl="5" w:tplc="1C090005" w:tentative="1">
+      <w:start w:val="1"/>
+      <w:numFmt w:val="bullet"/>
+      <w:lvlText w:val=""/>
+      <w:lvlJc w:val="left"/>
+      <w:pPr>
+        <w:ind w:left="4320" w:hanging="360"/>
+      </w:pPr>
+      <w:rPr>
+        <w:rFonts w:ascii="Wingdings" w:hAnsi="Wingdings" w:hint="default"/>
+      </w:rPr>
+    </w:lvl>
+    <w:lvl w:ilvl="6" w:tplc="1C090001" w:tentative="1">
+      <w:start w:val="1"/>
+      <w:numFmt w:val="bullet"/>
+      <w:lvlText w:val=""/>
+      <w:lvlJc w:val="left"/>
+      <w:pPr>
+        <w:ind w:left="5040" w:hanging="360"/>
+      </w:pPr>
+      <w:rPr>
+        <w:rFonts w:ascii="Symbol" w:hAnsi="Symbol" w:hint="default"/>
+      </w:rPr>
+    </w:lvl>
+    <w:lvl w:ilvl="7" w:tplc="1C090003" w:tentative="1">
+      <w:start w:val="1"/>
+      <w:numFmt w:val="bullet"/>
+      <w:lvlText w:val="o"/>
+      <w:lvlJc w:val="left"/>
+      <w:pPr>
+        <w:ind w:left="5760" w:hanging="360"/>
+      </w:pPr>
+      <w:rPr>
+        <w:rFonts w:ascii="Courier New" w:hAnsi="Courier New" w:cs="Courier New" w:hint="default"/>
+      </w:rPr>
+    </w:lvl>
+    <w:lvl w:ilvl="8" w:tplc="1C090005" w:tentative="1">
+      <w:start w:val="1"/>
+      <w:numFmt w:val="bullet"/>
+      <w:lvlText w:val=""/>
+      <w:lvlJc w:val="left"/>
+      <w:pPr>
+        <w:ind w:left="6480" w:hanging="360"/>
+      </w:pPr>
+      <w:rPr>
+        <w:rFonts w:ascii="Wingdings" w:hAnsi="Wingdings" w:hint="default"/>
+      </w:rPr>
+    </w:lvl>
+  </w:abstractNum>
+  <w:abstractNum w:abstractNumId="2" w15:restartNumberingAfterBreak="0">
+    <w:nsid w:val="3ADE0D83"/>
+    <w:multiLevelType w:val="hybridMultilevel"/>
+    <w:tmpl w:val="53AE99B0"/>
+    <w:lvl w:ilvl="0" w:tplc="1C090001">
+      <w:start w:val="1"/>
+      <w:numFmt w:val="bullet"/>
+      <w:lvlText w:val=""/>
+      <w:lvlJc w:val="left"/>
+      <w:pPr>
+        <w:ind w:left="720" w:hanging="360"/>
+      </w:pPr>
+      <w:rPr>
+        <w:rFonts w:ascii="Symbol" w:hAnsi="Symbol" w:hint="default"/>
+      </w:rPr>
+    </w:lvl>
+    <w:lvl w:ilvl="1" w:tplc="1C090003" w:tentative="1">
+      <w:start w:val="1"/>
+      <w:numFmt w:val="bullet"/>
+      <w:lvlText w:val="o"/>
+      <w:lvlJc w:val="left"/>
+      <w:pPr>
+        <w:ind w:left="1440" w:hanging="360"/>
+      </w:pPr>
+      <w:rPr>
+        <w:rFonts w:ascii="Courier New" w:hAnsi="Courier New" w:cs="Courier New" w:hint="default"/>
+      </w:rPr>
+    </w:lvl>
+    <w:lvl w:ilvl="2" w:tplc="1C090005" w:tentative="1">
+      <w:start w:val="1"/>
+      <w:numFmt w:val="bullet"/>
+      <w:lvlText w:val=""/>
+      <w:lvlJc w:val="left"/>
+      <w:pPr>
+        <w:ind w:left="2160" w:hanging="360"/>
+      </w:pPr>
+      <w:rPr>
+        <w:rFonts w:ascii="Wingdings" w:hAnsi="Wingdings" w:hint="default"/>
+      </w:rPr>
+    </w:lvl>
+    <w:lvl w:ilvl="3" w:tplc="1C090001" w:tentative="1">
+      <w:start w:val="1"/>
+      <w:numFmt w:val="bullet"/>
+      <w:lvlText w:val=""/>
+      <w:lvlJc w:val="left"/>
+      <w:pPr>
+        <w:ind w:left="2880" w:hanging="360"/>
+      </w:pPr>
+      <w:rPr>
+        <w:rFonts w:ascii="Symbol" w:hAnsi="Symbol" w:hint="default"/>
+      </w:rPr>
+    </w:lvl>
+    <w:lvl w:ilvl="4" w:tplc="1C090003" w:tentative="1">
+      <w:start w:val="1"/>
+      <w:numFmt w:val="bullet"/>
+      <w:lvlText w:val="o"/>
+      <w:lvlJc w:val="left"/>
+      <w:pPr>
+        <w:ind w:left="3600" w:hanging="360"/>
+      </w:pPr>
+      <w:rPr>
+        <w:rFonts w:ascii="Courier New" w:hAnsi="Courier New" w:cs="Courier New" w:hint="default"/>
+      </w:rPr>
+    </w:lvl>
+    <w:lvl w:ilvl="5" w:tplc="1C090005" w:tentative="1">
+      <w:start w:val="1"/>
+      <w:numFmt w:val="bullet"/>
+      <w:lvlText w:val=""/>
+      <w:lvlJc w:val="left"/>
+      <w:pPr>
+        <w:ind w:left="4320" w:hanging="360"/>
+      </w:pPr>
+      <w:rPr>
+        <w:rFonts w:ascii="Wingdings" w:hAnsi="Wingdings" w:hint="default"/>
+      </w:rPr>
+    </w:lvl>
+    <w:lvl w:ilvl="6" w:tplc="1C090001" w:tentative="1">
+      <w:start w:val="1"/>
+      <w:numFmt w:val="bullet"/>
+      <w:lvlText w:val=""/>
+      <w:lvlJc w:val="left"/>
+      <w:pPr>
+        <w:ind w:left="5040" w:hanging="360"/>
+      </w:pPr>
+      <w:rPr>
+        <w:rFonts w:ascii="Symbol" w:hAnsi="Symbol" w:hint="default"/>
+      </w:rPr>
+    </w:lvl>
+    <w:lvl w:ilvl="7" w:tplc="1C090003" w:tentative="1">
+      <w:start w:val="1"/>
+      <w:numFmt w:val="bullet"/>
+      <w:lvlText w:val="o"/>
+      <w:lvlJc w:val="left"/>
+      <w:pPr>
+        <w:ind w:left="5760" w:hanging="360"/>
+      </w:pPr>
+      <w:rPr>
+        <w:rFonts w:ascii="Courier New" w:hAnsi="Courier New" w:cs="Courier New" w:hint="default"/>
+      </w:rPr>
+    </w:lvl>
+    <w:lvl w:ilvl="8" w:tplc="1C090005" w:tentative="1">
+      <w:start w:val="1"/>
+      <w:numFmt w:val="bullet"/>
+      <w:lvlText w:val=""/>
+      <w:lvlJc w:val="left"/>
+      <w:pPr>
+        <w:ind w:left="6480" w:hanging="360"/>
+      </w:pPr>
+      <w:rPr>
+        <w:rFonts w:ascii="Wingdings" w:hAnsi="Wingdings" w:hint="default"/>
+      </w:rPr>
+    </w:lvl>
+  </w:abstractNum>
+  <w:abstractNum w:abstractNumId="3" w15:restartNumberingAfterBreak="0">
+    <w:nsid w:val="5CA73F46"/>
+    <w:multiLevelType w:val="hybridMultilevel"/>
+    <w:tmpl w:val="2AEAB690"/>
+    <w:lvl w:ilvl="0" w:tplc="1C090001">
+      <w:start w:val="1"/>
+      <w:numFmt w:val="bullet"/>
+      <w:lvlText w:val=""/>
+      <w:lvlJc w:val="left"/>
+      <w:pPr>
+        <w:ind w:left="720" w:hanging="360"/>
+      </w:pPr>
+      <w:rPr>
+        <w:rFonts w:ascii="Symbol" w:hAnsi="Symbol" w:hint="default"/>
+      </w:rPr>
+    </w:lvl>
+    <w:lvl w:ilvl="1" w:tplc="1C090003" w:tentative="1">
+      <w:start w:val="1"/>
+      <w:numFmt w:val="bullet"/>
+      <w:lvlText w:val="o"/>
+      <w:lvlJc w:val="left"/>
+      <w:pPr>
+        <w:ind w:left="1440" w:hanging="360"/>
+      </w:pPr>
+      <w:rPr>
+        <w:rFonts w:ascii="Courier New" w:hAnsi="Courier New" w:cs="Courier New" w:hint="default"/>
+      </w:rPr>
+    </w:lvl>
+    <w:lvl w:ilvl="2" w:tplc="1C090005" w:tentative="1">
+      <w:start w:val="1"/>
+      <w:numFmt w:val="bullet"/>
+      <w:lvlText w:val=""/>
+      <w:lvlJc w:val="left"/>
+      <w:pPr>
+        <w:ind w:left="2160" w:hanging="360"/>
+      </w:pPr>
+      <w:rPr>
+        <w:rFonts w:ascii="Wingdings" w:hAnsi="Wingdings" w:hint="default"/>
+      </w:rPr>
+    </w:lvl>
+    <w:lvl w:ilvl="3" w:tplc="1C090001" w:tentative="1">
+      <w:start w:val="1"/>
+      <w:numFmt w:val="bullet"/>
+      <w:lvlText w:val=""/>
+      <w:lvlJc w:val="left"/>
+      <w:pPr>
+        <w:ind w:left="2880" w:hanging="360"/>
+      </w:pPr>
+      <w:rPr>
+        <w:rFonts w:ascii="Symbol" w:hAnsi="Symbol" w:hint="default"/>
+      </w:rPr>
+    </w:lvl>
+    <w:lvl w:ilvl="4" w:tplc="1C090003" w:tentative="1">
+      <w:start w:val="1"/>
+      <w:numFmt w:val="bullet"/>
+      <w:lvlText w:val="o"/>
+      <w:lvlJc w:val="left"/>
+      <w:pPr>
+        <w:ind w:left="3600" w:hanging="360"/>
+      </w:pPr>
+      <w:rPr>
+        <w:rFonts w:ascii="Courier New" w:hAnsi="Courier New" w:cs="Courier New" w:hint="default"/>
+      </w:rPr>
+    </w:lvl>
+    <w:lvl w:ilvl="5" w:tplc="1C090005" w:tentative="1">
+      <w:start w:val="1"/>
+      <w:numFmt w:val="bullet"/>
+      <w:lvlText w:val=""/>
+      <w:lvlJc w:val="left"/>
+      <w:pPr>
+        <w:ind w:left="4320" w:hanging="360"/>
+      </w:pPr>
+      <w:rPr>
+        <w:rFonts w:ascii="Wingdings" w:hAnsi="Wingdings" w:hint="default"/>
+      </w:rPr>
+    </w:lvl>
+    <w:lvl w:ilvl="6" w:tplc="1C090001" w:tentative="1">
+      <w:start w:val="1"/>
+      <w:numFmt w:val="bullet"/>
+      <w:lvlText w:val=""/>
+      <w:lvlJc w:val="left"/>
+      <w:pPr>
+        <w:ind w:left="5040" w:hanging="360"/>
+      </w:pPr>
+      <w:rPr>
+        <w:rFonts w:ascii="Symbol" w:hAnsi="Symbol" w:hint="default"/>
+      </w:rPr>
+    </w:lvl>
+    <w:lvl w:ilvl="7" w:tplc="1C090003" w:tentative="1">
+      <w:start w:val="1"/>
+      <w:numFmt w:val="bullet"/>
+      <w:lvlText w:val="o"/>
+      <w:lvlJc w:val="left"/>
+      <w:pPr>
+        <w:ind w:left="5760" w:hanging="360"/>
+      </w:pPr>
+      <w:rPr>
+        <w:rFonts w:ascii="Courier New" w:hAnsi="Courier New" w:cs="Courier New" w:hint="default"/>
+      </w:rPr>
+    </w:lvl>
+    <w:lvl w:ilvl="8" w:tplc="1C090005" w:tentative="1">
+      <w:start w:val="1"/>
+      <w:numFmt w:val="bullet"/>
+      <w:lvlText w:val=""/>
+      <w:lvlJc w:val="left"/>
+      <w:pPr>
+        <w:ind w:left="6480" w:hanging="360"/>
+      </w:pPr>
+      <w:rPr>
+        <w:rFonts w:ascii="Wingdings" w:hAnsi="Wingdings" w:hint="default"/>
+      </w:rPr>
+    </w:lvl>
+  </w:abstractNum>
   <w:num w:numId="1" w16cid:durableId="2109235221">
+    <w:abstractNumId w:val="3"/>
+  </w:num>
+  <w:num w:numId="2" w16cid:durableId="2002810144">
     <w:abstractNumId w:val="0"/>
+  </w:num>
+  <w:num w:numId="3" w16cid:durableId="250505971">
+    <w:abstractNumId w:val="1"/>
+  </w:num>
+  <w:num w:numId="4" w16cid:durableId="1171021955">
+    <w:abstractNumId w:val="2"/>
   </w:num>
 </w:numbering>
 </file>
@@ -3580,7 +3797,6 @@
     <w:next w:val="Normal"/>
     <w:link w:val="Heading2Char"/>
     <w:uiPriority w:val="9"/>
-    <w:semiHidden/>
     <w:unhideWhenUsed/>
     <w:qFormat/>
     <w:rsid w:val="007B1683"/>
@@ -3603,7 +3819,6 @@
     <w:next w:val="Normal"/>
     <w:link w:val="Heading3Char"/>
     <w:uiPriority w:val="9"/>
-    <w:semiHidden/>
     <w:unhideWhenUsed/>
     <w:qFormat/>
     <w:rsid w:val="007B1683"/>
@@ -3755,7 +3970,6 @@
   <w:style w:type="character" w:default="1" w:styleId="DefaultParagraphFont">
     <w:name w:val="Default Paragraph Font"/>
     <w:uiPriority w:val="1"/>
-    <w:semiHidden/>
     <w:unhideWhenUsed/>
   </w:style>
   <w:style w:type="table" w:default="1" w:styleId="TableNormal">
@@ -3797,7 +4011,6 @@
     <w:basedOn w:val="DefaultParagraphFont"/>
     <w:link w:val="Heading2"/>
     <w:uiPriority w:val="9"/>
-    <w:semiHidden/>
     <w:rsid w:val="007B1683"/>
     <w:rPr>
       <w:rFonts w:asciiTheme="majorHAnsi" w:eastAsiaTheme="majorEastAsia" w:hAnsiTheme="majorHAnsi" w:cstheme="majorBidi"/>
@@ -3811,7 +4024,6 @@
     <w:basedOn w:val="DefaultParagraphFont"/>
     <w:link w:val="Heading3"/>
     <w:uiPriority w:val="9"/>
-    <w:semiHidden/>
     <w:rsid w:val="007B1683"/>
     <w:rPr>
       <w:rFonts w:eastAsiaTheme="majorEastAsia" w:cstheme="majorBidi"/>

</xml_diff>